<commit_message>
docs: add service concepts, language selection and polyglot architecture
</commit_message>
<xml_diff>
--- a/The Story of Software Architecture.docx
+++ b/The Story of Software Architecture.docx
@@ -37,7 +37,7 @@
     <w:p>
       <w:r>
         <w:pict w14:anchorId="35601091">
-          <v:rect id="_x0000_i1366" style="width:0;height:1.5pt" o:hralign="center" o:hrstd="t" o:hr="t" fillcolor="#a0a0a0" stroked="f"/>
+          <v:rect id="_x0000_i1025" style="width:0;height:1.5pt" o:hralign="center" o:hrstd="t" o:hr="t" fillcolor="#a0a0a0" stroked="f"/>
         </w:pict>
       </w:r>
     </w:p>
@@ -274,7 +274,7 @@
     <w:p>
       <w:r>
         <w:pict w14:anchorId="416869AF">
-          <v:rect id="_x0000_i1367" style="width:0;height:1.5pt" o:hralign="center" o:hrstd="t" o:hr="t" fillcolor="#a0a0a0" stroked="f"/>
+          <v:rect id="_x0000_i1026" style="width:0;height:1.5pt" o:hralign="center" o:hrstd="t" o:hr="t" fillcolor="#a0a0a0" stroked="f"/>
         </w:pict>
       </w:r>
     </w:p>
@@ -410,7 +410,7 @@
     <w:p>
       <w:r>
         <w:pict w14:anchorId="5DAB44B3">
-          <v:rect id="_x0000_i1368" style="width:0;height:1.5pt" o:hralign="center" o:hrstd="t" o:hr="t" fillcolor="#a0a0a0" stroked="f"/>
+          <v:rect id="_x0000_i1027" style="width:0;height:1.5pt" o:hralign="center" o:hrstd="t" o:hr="t" fillcolor="#a0a0a0" stroked="f"/>
         </w:pict>
       </w:r>
     </w:p>
@@ -487,7 +487,7 @@
     <w:p>
       <w:r>
         <w:pict w14:anchorId="0E7776F9">
-          <v:rect id="_x0000_i1369" style="width:0;height:1.5pt" o:hralign="center" o:hrstd="t" o:hr="t" fillcolor="#a0a0a0" stroked="f"/>
+          <v:rect id="_x0000_i1028" style="width:0;height:1.5pt" o:hralign="center" o:hrstd="t" o:hr="t" fillcolor="#a0a0a0" stroked="f"/>
         </w:pict>
       </w:r>
     </w:p>
@@ -606,7 +606,7 @@
     <w:p>
       <w:r>
         <w:pict w14:anchorId="181BF02C">
-          <v:rect id="_x0000_i1370" style="width:0;height:1.5pt" o:hralign="center" o:hrstd="t" o:hr="t" fillcolor="#a0a0a0" stroked="f"/>
+          <v:rect id="_x0000_i1029" style="width:0;height:1.5pt" o:hralign="center" o:hrstd="t" o:hr="t" fillcolor="#a0a0a0" stroked="f"/>
         </w:pict>
       </w:r>
     </w:p>
@@ -639,7 +639,7 @@
     <w:p>
       <w:r>
         <w:pict w14:anchorId="02D986EE">
-          <v:rect id="_x0000_i1371" style="width:0;height:1.5pt" o:hralign="center" o:hrstd="t" o:hr="t" fillcolor="#a0a0a0" stroked="f"/>
+          <v:rect id="_x0000_i1030" style="width:0;height:1.5pt" o:hralign="center" o:hrstd="t" o:hr="t" fillcolor="#a0a0a0" stroked="f"/>
         </w:pict>
       </w:r>
     </w:p>
@@ -844,7 +844,7 @@
     <w:p>
       <w:r>
         <w:pict w14:anchorId="207341A1">
-          <v:rect id="_x0000_i1378" style="width:0;height:1.5pt" o:hralign="center" o:hrstd="t" o:hr="t" fillcolor="#a0a0a0" stroked="f"/>
+          <v:rect id="_x0000_i1031" style="width:0;height:1.5pt" o:hralign="center" o:hrstd="t" o:hr="t" fillcolor="#a0a0a0" stroked="f"/>
         </w:pict>
       </w:r>
     </w:p>
@@ -892,7 +892,7 @@
     <w:p>
       <w:r>
         <w:pict w14:anchorId="75DBE3CB">
-          <v:rect id="_x0000_i1373" style="width:0;height:1.5pt" o:hralign="center" o:hrstd="t" o:hr="t" fillcolor="#a0a0a0" stroked="f"/>
+          <v:rect id="_x0000_i1032" style="width:0;height:1.5pt" o:hralign="center" o:hrstd="t" o:hr="t" fillcolor="#a0a0a0" stroked="f"/>
         </w:pict>
       </w:r>
     </w:p>
@@ -942,7 +942,7 @@
     <w:p>
       <w:r>
         <w:pict w14:anchorId="0FBEDB02">
-          <v:rect id="_x0000_i1374" style="width:0;height:1.5pt" o:hralign="center" o:hrstd="t" o:hr="t" fillcolor="#a0a0a0" stroked="f"/>
+          <v:rect id="_x0000_i1033" style="width:0;height:1.5pt" o:hralign="center" o:hrstd="t" o:hr="t" fillcolor="#a0a0a0" stroked="f"/>
         </w:pict>
       </w:r>
     </w:p>
@@ -1090,7 +1090,7 @@
     <w:p>
       <w:r>
         <w:pict w14:anchorId="27E4A3BC">
-          <v:rect id="_x0000_i1375" style="width:0;height:1.5pt" o:hralign="center" o:hrstd="t" o:hr="t" fillcolor="#a0a0a0" stroked="f"/>
+          <v:rect id="_x0000_i1034" style="width:0;height:1.5pt" o:hralign="center" o:hrstd="t" o:hr="t" fillcolor="#a0a0a0" stroked="f"/>
         </w:pict>
       </w:r>
     </w:p>
@@ -1183,8 +1183,1819 @@
     <w:p>
       <w:r>
         <w:pict w14:anchorId="096A2C21">
-          <v:rect id="_x0000_i1376" style="width:0;height:1.5pt" o:hralign="center" o:hrstd="t" o:hr="t" fillcolor="#a0a0a0" stroked="f"/>
+          <v:rect id="_x0000_i1035" style="width:0;height:1.5pt" o:hralign="center" o:hrstd="t" o:hr="t" fillcolor="#a0a0a0" stroked="f"/>
         </w:pict>
+      </w:r>
+    </w:p>
+    <w:p>
+      <w:pPr>
+        <w:rPr>
+          <w:b/>
+          <w:bCs/>
+        </w:rPr>
+      </w:pPr>
+      <w:r>
+        <w:rPr>
+          <w:b/>
+          <w:bCs/>
+        </w:rPr>
+        <w:t>What is a Service?</w:t>
+      </w:r>
+    </w:p>
+    <w:p>
+      <w:r>
+        <w:t xml:space="preserve">A </w:t>
+      </w:r>
+      <w:r>
+        <w:rPr>
+          <w:b/>
+          <w:bCs/>
+        </w:rPr>
+        <w:t>service</w:t>
+      </w:r>
+      <w:r>
+        <w:t xml:space="preserve"> is an </w:t>
+      </w:r>
+      <w:r>
+        <w:rPr>
+          <w:b/>
+          <w:bCs/>
+        </w:rPr>
+        <w:t>independent application</w:t>
+      </w:r>
+      <w:r>
+        <w:t xml:space="preserve"> that is responsible for </w:t>
+      </w:r>
+      <w:r>
+        <w:rPr>
+          <w:b/>
+          <w:bCs/>
+        </w:rPr>
+        <w:t>one business capability</w:t>
+      </w:r>
+      <w:r>
+        <w:t>.</w:t>
+      </w:r>
+    </w:p>
+    <w:p>
+      <w:r>
+        <w:t>It performs a specific job and manages everything related to that responsibility.</w:t>
+      </w:r>
+    </w:p>
+    <w:p>
+      <w:pPr>
+        <w:rPr>
+          <w:b/>
+          <w:bCs/>
+        </w:rPr>
+      </w:pPr>
+      <w:r>
+        <w:rPr>
+          <w:b/>
+          <w:bCs/>
+        </w:rPr>
+        <w:t>Example</w:t>
+      </w:r>
+    </w:p>
+    <w:p>
+      <w:r>
+        <w:t>In an e-commerce system</w:t>
+      </w:r>
+      <w:r>
+        <w:t xml:space="preserve"> like </w:t>
+      </w:r>
+      <w:r>
+        <w:t>Amazon</w:t>
+      </w:r>
+      <w:r>
+        <w:t>:</w:t>
+      </w:r>
+    </w:p>
+    <w:p>
+      <w:pPr>
+        <w:rPr>
+          <w:b/>
+          <w:bCs/>
+        </w:rPr>
+      </w:pPr>
+      <w:r>
+        <w:rPr>
+          <w:b/>
+          <w:bCs/>
+        </w:rPr>
+        <w:t>User Service</w:t>
+      </w:r>
+    </w:p>
+    <w:p>
+      <w:r>
+        <w:t>Its responsibility is:</w:t>
+      </w:r>
+    </w:p>
+    <w:p>
+      <w:pPr>
+        <w:numPr>
+          <w:ilvl w:val="0"/>
+          <w:numId w:val="10"/>
+        </w:numPr>
+      </w:pPr>
+      <w:r>
+        <w:t>User Registration</w:t>
+      </w:r>
+    </w:p>
+    <w:p>
+      <w:pPr>
+        <w:numPr>
+          <w:ilvl w:val="0"/>
+          <w:numId w:val="10"/>
+        </w:numPr>
+      </w:pPr>
+      <w:r>
+        <w:t>Login</w:t>
+      </w:r>
+    </w:p>
+    <w:p>
+      <w:pPr>
+        <w:numPr>
+          <w:ilvl w:val="0"/>
+          <w:numId w:val="10"/>
+        </w:numPr>
+      </w:pPr>
+      <w:r>
+        <w:t>Profile Management</w:t>
+      </w:r>
+    </w:p>
+    <w:p>
+      <w:pPr>
+        <w:numPr>
+          <w:ilvl w:val="0"/>
+          <w:numId w:val="10"/>
+        </w:numPr>
+      </w:pPr>
+      <w:r>
+        <w:t>Password Reset</w:t>
+      </w:r>
+    </w:p>
+    <w:p>
+      <w:r>
+        <w:lastRenderedPageBreak/>
+        <w:t xml:space="preserve">Everything related to </w:t>
+      </w:r>
+      <w:r>
+        <w:rPr>
+          <w:b/>
+          <w:bCs/>
+        </w:rPr>
+        <w:t>users</w:t>
+      </w:r>
+      <w:r>
+        <w:t xml:space="preserve"> belongs here.</w:t>
+      </w:r>
+    </w:p>
+    <w:p>
+      <w:pPr>
+        <w:rPr>
+          <w:b/>
+          <w:bCs/>
+        </w:rPr>
+      </w:pPr>
+      <w:r>
+        <w:rPr>
+          <w:b/>
+          <w:bCs/>
+        </w:rPr>
+        <w:t>Product Service</w:t>
+      </w:r>
+    </w:p>
+    <w:p>
+      <w:r>
+        <w:t>Its responsibility is:</w:t>
+      </w:r>
+    </w:p>
+    <w:p>
+      <w:pPr>
+        <w:numPr>
+          <w:ilvl w:val="0"/>
+          <w:numId w:val="11"/>
+        </w:numPr>
+      </w:pPr>
+      <w:r>
+        <w:t>Add Product</w:t>
+      </w:r>
+    </w:p>
+    <w:p>
+      <w:pPr>
+        <w:numPr>
+          <w:ilvl w:val="0"/>
+          <w:numId w:val="11"/>
+        </w:numPr>
+      </w:pPr>
+      <w:r>
+        <w:t>Update Product</w:t>
+      </w:r>
+    </w:p>
+    <w:p>
+      <w:pPr>
+        <w:numPr>
+          <w:ilvl w:val="0"/>
+          <w:numId w:val="11"/>
+        </w:numPr>
+      </w:pPr>
+      <w:r>
+        <w:t>Delete Product</w:t>
+      </w:r>
+    </w:p>
+    <w:p>
+      <w:pPr>
+        <w:numPr>
+          <w:ilvl w:val="0"/>
+          <w:numId w:val="11"/>
+        </w:numPr>
+      </w:pPr>
+      <w:r>
+        <w:t>Search Products</w:t>
+      </w:r>
+    </w:p>
+    <w:p>
+      <w:r>
+        <w:t xml:space="preserve">Everything related to </w:t>
+      </w:r>
+      <w:r>
+        <w:rPr>
+          <w:b/>
+          <w:bCs/>
+        </w:rPr>
+        <w:t>products</w:t>
+      </w:r>
+      <w:r>
+        <w:t xml:space="preserve"> belongs here.</w:t>
+      </w:r>
+    </w:p>
+    <w:p>
+      <w:r>
+        <w:pict w14:anchorId="5AAF49A6">
+          <v:rect id="_x0000_i1036" style="width:0;height:1.5pt" o:hralign="center" o:hrstd="t" o:hr="t" fillcolor="#a0a0a0" stroked="f"/>
+        </w:pict>
+      </w:r>
+    </w:p>
+    <w:p>
+      <w:pPr>
+        <w:rPr>
+          <w:b/>
+          <w:bCs/>
+        </w:rPr>
+      </w:pPr>
+      <w:r>
+        <w:rPr>
+          <w:b/>
+          <w:bCs/>
+        </w:rPr>
+        <w:t>What Should Become a Service?</w:t>
+      </w:r>
+    </w:p>
+    <w:p>
+      <w:r>
+        <w:t>Before creating microservices, the most important question is:</w:t>
+      </w:r>
+    </w:p>
+    <w:p>
+      <w:r>
+        <w:rPr>
+          <w:b/>
+          <w:bCs/>
+        </w:rPr>
+        <w:t>Which part of my project should become a service?</w:t>
+      </w:r>
+    </w:p>
+    <w:p>
+      <w:r>
+        <w:t>Many beginners make the mistake of splitting their application based on folders or features.</w:t>
+      </w:r>
+    </w:p>
+    <w:p>
+      <w:r>
+        <w:t xml:space="preserve">That is </w:t>
+      </w:r>
+      <w:r>
+        <w:rPr>
+          <w:b/>
+          <w:bCs/>
+        </w:rPr>
+        <w:t>not</w:t>
+      </w:r>
+      <w:r>
+        <w:t xml:space="preserve"> how services are identified.</w:t>
+      </w:r>
+    </w:p>
+    <w:p>
+      <w:pPr>
+        <w:rPr>
+          <w:b/>
+          <w:bCs/>
+        </w:rPr>
+      </w:pPr>
+      <w:r>
+        <w:rPr>
+          <w:b/>
+          <w:bCs/>
+        </w:rPr>
+        <w:t>The Rule</w:t>
+      </w:r>
+    </w:p>
+    <w:p>
+      <w:r>
+        <w:t xml:space="preserve">A service should represent </w:t>
+      </w:r>
+      <w:r>
+        <w:rPr>
+          <w:b/>
+          <w:bCs/>
+        </w:rPr>
+        <w:t>one business responsibility</w:t>
+      </w:r>
+      <w:r>
+        <w:t xml:space="preserve"> (also called a </w:t>
+      </w:r>
+      <w:r>
+        <w:rPr>
+          <w:b/>
+          <w:bCs/>
+        </w:rPr>
+        <w:t>business capability</w:t>
+      </w:r>
+      <w:r>
+        <w:t>).</w:t>
+      </w:r>
+    </w:p>
+    <w:p>
+      <w:r>
+        <w:t>Ask yourself:</w:t>
+      </w:r>
+    </w:p>
+    <w:p>
+      <w:r>
+        <w:rPr>
+          <w:b/>
+          <w:bCs/>
+        </w:rPr>
+        <w:t>"What is the main job of this part of the system?"</w:t>
+      </w:r>
+    </w:p>
+    <w:p>
+      <w:r>
+        <w:t>If it has one clear responsibility, it can become a service.</w:t>
+      </w:r>
+    </w:p>
+    <w:p>
+      <w:pPr>
+        <w:rPr>
+          <w:b/>
+          <w:bCs/>
+        </w:rPr>
+      </w:pPr>
+      <w:r>
+        <w:rPr>
+          <w:b/>
+          <w:bCs/>
+        </w:rPr>
+        <w:t>Example: E-commerce Website</w:t>
+      </w:r>
+      <w:r>
+        <w:rPr>
+          <w:b/>
+          <w:bCs/>
+        </w:rPr>
+        <w:t xml:space="preserve"> like </w:t>
+      </w:r>
+      <w:r>
+        <w:rPr>
+          <w:b/>
+          <w:bCs/>
+        </w:rPr>
+        <w:t>Amazon</w:t>
+      </w:r>
+    </w:p>
+    <w:p>
+      <w:r>
+        <w:t>The system has:</w:t>
+      </w:r>
+    </w:p>
+    <w:p>
+      <w:r>
+        <w:t>Users</w:t>
+      </w:r>
+    </w:p>
+    <w:p>
+      <w:r>
+        <w:t>Products</w:t>
+      </w:r>
+    </w:p>
+    <w:p>
+      <w:r>
+        <w:t>Orders</w:t>
+      </w:r>
+    </w:p>
+    <w:p>
+      <w:r>
+        <w:t>Payments</w:t>
+      </w:r>
+    </w:p>
+    <w:p>
+      <w:r>
+        <w:lastRenderedPageBreak/>
+        <w:t>These are different business responsibilities.</w:t>
+      </w:r>
+    </w:p>
+    <w:p>
+      <w:proofErr w:type="gramStart"/>
+      <w:r>
+        <w:t>So</w:t>
+      </w:r>
+      <w:proofErr w:type="gramEnd"/>
+      <w:r>
+        <w:t xml:space="preserve"> they can become different services.</w:t>
+      </w:r>
+    </w:p>
+    <w:p>
+      <w:r>
+        <w:t>User Service</w:t>
+      </w:r>
+    </w:p>
+    <w:p>
+      <w:r>
+        <w:rPr>
+          <w:rFonts w:ascii="MS Gothic" w:eastAsia="MS Gothic" w:hAnsi="MS Gothic" w:cs="MS Gothic" w:hint="eastAsia"/>
+        </w:rPr>
+        <w:t>├</w:t>
+      </w:r>
+      <w:r>
+        <w:rPr>
+          <w:rFonts w:ascii="Aptos" w:hAnsi="Aptos" w:cs="Aptos"/>
+        </w:rPr>
+        <w:t>──</w:t>
+      </w:r>
+      <w:r>
+        <w:t xml:space="preserve"> Register User</w:t>
+      </w:r>
+    </w:p>
+    <w:p>
+      <w:r>
+        <w:rPr>
+          <w:rFonts w:ascii="MS Gothic" w:eastAsia="MS Gothic" w:hAnsi="MS Gothic" w:cs="MS Gothic" w:hint="eastAsia"/>
+        </w:rPr>
+        <w:t>├</w:t>
+      </w:r>
+      <w:r>
+        <w:rPr>
+          <w:rFonts w:ascii="Aptos" w:hAnsi="Aptos" w:cs="Aptos"/>
+        </w:rPr>
+        <w:t>──</w:t>
+      </w:r>
+      <w:r>
+        <w:t xml:space="preserve"> Login</w:t>
+      </w:r>
+    </w:p>
+    <w:p>
+      <w:r>
+        <w:rPr>
+          <w:rFonts w:ascii="MS Gothic" w:eastAsia="MS Gothic" w:hAnsi="MS Gothic" w:cs="MS Gothic" w:hint="eastAsia"/>
+        </w:rPr>
+        <w:t>├</w:t>
+      </w:r>
+      <w:r>
+        <w:rPr>
+          <w:rFonts w:ascii="Aptos" w:hAnsi="Aptos" w:cs="Aptos"/>
+        </w:rPr>
+        <w:t>──</w:t>
+      </w:r>
+      <w:r>
+        <w:t xml:space="preserve"> Update Profile</w:t>
+      </w:r>
+    </w:p>
+    <w:p/>
+    <w:p>
+      <w:r>
+        <w:t>Product Service</w:t>
+      </w:r>
+    </w:p>
+    <w:p>
+      <w:r>
+        <w:rPr>
+          <w:rFonts w:ascii="MS Gothic" w:eastAsia="MS Gothic" w:hAnsi="MS Gothic" w:cs="MS Gothic" w:hint="eastAsia"/>
+        </w:rPr>
+        <w:t>├</w:t>
+      </w:r>
+      <w:r>
+        <w:rPr>
+          <w:rFonts w:ascii="Aptos" w:hAnsi="Aptos" w:cs="Aptos"/>
+        </w:rPr>
+        <w:t>──</w:t>
+      </w:r>
+      <w:r>
+        <w:t xml:space="preserve"> Add Product</w:t>
+      </w:r>
+    </w:p>
+    <w:p>
+      <w:r>
+        <w:rPr>
+          <w:rFonts w:ascii="MS Gothic" w:eastAsia="MS Gothic" w:hAnsi="MS Gothic" w:cs="MS Gothic" w:hint="eastAsia"/>
+        </w:rPr>
+        <w:t>├</w:t>
+      </w:r>
+      <w:r>
+        <w:rPr>
+          <w:rFonts w:ascii="Aptos" w:hAnsi="Aptos" w:cs="Aptos"/>
+        </w:rPr>
+        <w:t>──</w:t>
+      </w:r>
+      <w:r>
+        <w:t xml:space="preserve"> Update Product</w:t>
+      </w:r>
+    </w:p>
+    <w:p>
+      <w:r>
+        <w:rPr>
+          <w:rFonts w:ascii="MS Gothic" w:eastAsia="MS Gothic" w:hAnsi="MS Gothic" w:cs="MS Gothic" w:hint="eastAsia"/>
+        </w:rPr>
+        <w:t>├</w:t>
+      </w:r>
+      <w:r>
+        <w:rPr>
+          <w:rFonts w:ascii="Aptos" w:hAnsi="Aptos" w:cs="Aptos"/>
+        </w:rPr>
+        <w:t>──</w:t>
+      </w:r>
+      <w:r>
+        <w:t xml:space="preserve"> Delete Product</w:t>
+      </w:r>
+    </w:p>
+    <w:p/>
+    <w:p>
+      <w:r>
+        <w:t>Order Service</w:t>
+      </w:r>
+    </w:p>
+    <w:p>
+      <w:r>
+        <w:rPr>
+          <w:rFonts w:ascii="MS Gothic" w:eastAsia="MS Gothic" w:hAnsi="MS Gothic" w:cs="MS Gothic" w:hint="eastAsia"/>
+        </w:rPr>
+        <w:t>├</w:t>
+      </w:r>
+      <w:r>
+        <w:rPr>
+          <w:rFonts w:ascii="Aptos" w:hAnsi="Aptos" w:cs="Aptos"/>
+        </w:rPr>
+        <w:t>──</w:t>
+      </w:r>
+      <w:r>
+        <w:t xml:space="preserve"> Create Order</w:t>
+      </w:r>
+    </w:p>
+    <w:p>
+      <w:r>
+        <w:rPr>
+          <w:rFonts w:ascii="MS Gothic" w:eastAsia="MS Gothic" w:hAnsi="MS Gothic" w:cs="MS Gothic" w:hint="eastAsia"/>
+        </w:rPr>
+        <w:t>├</w:t>
+      </w:r>
+      <w:r>
+        <w:rPr>
+          <w:rFonts w:ascii="Aptos" w:hAnsi="Aptos" w:cs="Aptos"/>
+        </w:rPr>
+        <w:t>──</w:t>
+      </w:r>
+      <w:r>
+        <w:t xml:space="preserve"> Cancel Order</w:t>
+      </w:r>
+    </w:p>
+    <w:p/>
+    <w:p>
+      <w:r>
+        <w:t>Payment Service</w:t>
+      </w:r>
+    </w:p>
+    <w:p>
+      <w:r>
+        <w:rPr>
+          <w:rFonts w:ascii="MS Gothic" w:eastAsia="MS Gothic" w:hAnsi="MS Gothic" w:cs="MS Gothic" w:hint="eastAsia"/>
+        </w:rPr>
+        <w:t>├</w:t>
+      </w:r>
+      <w:r>
+        <w:rPr>
+          <w:rFonts w:ascii="Aptos" w:hAnsi="Aptos" w:cs="Aptos"/>
+        </w:rPr>
+        <w:t>──</w:t>
+      </w:r>
+      <w:r>
+        <w:t xml:space="preserve"> Make Payment</w:t>
+      </w:r>
+    </w:p>
+    <w:p>
+      <w:r>
+        <w:rPr>
+          <w:rFonts w:ascii="MS Gothic" w:eastAsia="MS Gothic" w:hAnsi="MS Gothic" w:cs="MS Gothic" w:hint="eastAsia"/>
+        </w:rPr>
+        <w:t>├</w:t>
+      </w:r>
+      <w:r>
+        <w:rPr>
+          <w:rFonts w:ascii="Aptos" w:hAnsi="Aptos" w:cs="Aptos"/>
+        </w:rPr>
+        <w:t>──</w:t>
+      </w:r>
+      <w:r>
+        <w:t xml:space="preserve"> Refund Payment</w:t>
+      </w:r>
+    </w:p>
+    <w:p/>
+    <w:p>
+      <w:r>
+        <w:t xml:space="preserve">Notice that each service has </w:t>
+      </w:r>
+      <w:r>
+        <w:rPr>
+          <w:b/>
+          <w:bCs/>
+        </w:rPr>
+        <w:t>one main responsibility</w:t>
+      </w:r>
+      <w:r>
+        <w:t>.</w:t>
+      </w:r>
+    </w:p>
+    <w:p/>
+    <w:p/>
+    <w:p/>
+    <w:p/>
+    <w:p>
+      <w:pPr>
+        <w:rPr>
+          <w:b/>
+          <w:bCs/>
+        </w:rPr>
+      </w:pPr>
+      <w:r>
+        <w:rPr>
+          <w:b/>
+          <w:bCs/>
+        </w:rPr>
+        <w:lastRenderedPageBreak/>
+        <w:t>What Should NOT Become a Service?</w:t>
+      </w:r>
+    </w:p>
+    <w:p>
+      <w:r>
+        <w:t>Suppose your project has these features:</w:t>
+      </w:r>
+    </w:p>
+    <w:p>
+      <w:r>
+        <w:t>Login</w:t>
+      </w:r>
+    </w:p>
+    <w:p>
+      <w:r>
+        <w:t>Register</w:t>
+      </w:r>
+    </w:p>
+    <w:p>
+      <w:r>
+        <w:t>Forgot Password</w:t>
+      </w:r>
+    </w:p>
+    <w:p>
+      <w:r>
+        <w:t>Reset Password</w:t>
+      </w:r>
+    </w:p>
+    <w:p>
+      <w:r>
+        <w:t>Should these become four different services?</w:t>
+      </w:r>
+    </w:p>
+    <w:p>
+      <w:r>
+        <w:rPr>
+          <w:rFonts w:ascii="Segoe UI Emoji" w:hAnsi="Segoe UI Emoji" w:cs="Segoe UI Emoji"/>
+        </w:rPr>
+        <w:t>❌</w:t>
+      </w:r>
+      <w:r>
+        <w:t xml:space="preserve"> No.</w:t>
+      </w:r>
+    </w:p>
+    <w:p>
+      <w:r>
+        <w:t>Why?</w:t>
+      </w:r>
+    </w:p>
+    <w:p>
+      <w:r>
+        <w:t>Because all of them belong to the same business responsibility:</w:t>
+      </w:r>
+    </w:p>
+    <w:p>
+      <w:r>
+        <w:t>Authentication</w:t>
+      </w:r>
+    </w:p>
+    <w:p>
+      <w:r>
+        <w:t>So,</w:t>
+      </w:r>
+      <w:r>
+        <w:t xml:space="preserve"> they should stay together inside one service.</w:t>
+      </w:r>
+    </w:p>
+    <w:p>
+      <w:r>
+        <w:t>Auth Service</w:t>
+      </w:r>
+    </w:p>
+    <w:p>
+      <w:r>
+        <w:rPr>
+          <w:rFonts w:ascii="MS Gothic" w:eastAsia="MS Gothic" w:hAnsi="MS Gothic" w:cs="MS Gothic" w:hint="eastAsia"/>
+        </w:rPr>
+        <w:t>├</w:t>
+      </w:r>
+      <w:r>
+        <w:rPr>
+          <w:rFonts w:ascii="Aptos" w:hAnsi="Aptos" w:cs="Aptos"/>
+        </w:rPr>
+        <w:t>──</w:t>
+      </w:r>
+      <w:r>
+        <w:t xml:space="preserve"> Login</w:t>
+      </w:r>
+    </w:p>
+    <w:p>
+      <w:r>
+        <w:rPr>
+          <w:rFonts w:ascii="MS Gothic" w:eastAsia="MS Gothic" w:hAnsi="MS Gothic" w:cs="MS Gothic" w:hint="eastAsia"/>
+        </w:rPr>
+        <w:t>├</w:t>
+      </w:r>
+      <w:r>
+        <w:rPr>
+          <w:rFonts w:ascii="Aptos" w:hAnsi="Aptos" w:cs="Aptos"/>
+        </w:rPr>
+        <w:t>──</w:t>
+      </w:r>
+      <w:r>
+        <w:t xml:space="preserve"> Register</w:t>
+      </w:r>
+    </w:p>
+    <w:p>
+      <w:r>
+        <w:rPr>
+          <w:rFonts w:ascii="MS Gothic" w:eastAsia="MS Gothic" w:hAnsi="MS Gothic" w:cs="MS Gothic" w:hint="eastAsia"/>
+        </w:rPr>
+        <w:t>├</w:t>
+      </w:r>
+      <w:r>
+        <w:rPr>
+          <w:rFonts w:ascii="Aptos" w:hAnsi="Aptos" w:cs="Aptos"/>
+        </w:rPr>
+        <w:t>──</w:t>
+      </w:r>
+      <w:r>
+        <w:t xml:space="preserve"> Forgot Password</w:t>
+      </w:r>
+    </w:p>
+    <w:p>
+      <w:r>
+        <w:t>└── Reset Password</w:t>
+      </w:r>
+    </w:p>
+    <w:p>
+      <w:pPr>
+        <w:tabs>
+          <w:tab w:val="left" w:pos="3780"/>
+        </w:tabs>
+      </w:pPr>
+      <w:r>
+        <w:tab/>
+      </w:r>
+    </w:p>
+    <w:p>
+      <w:pPr>
+        <w:tabs>
+          <w:tab w:val="left" w:pos="3780"/>
+        </w:tabs>
+      </w:pPr>
+    </w:p>
+    <w:p>
+      <w:pPr>
+        <w:tabs>
+          <w:tab w:val="left" w:pos="3780"/>
+        </w:tabs>
+      </w:pPr>
+    </w:p>
+    <w:p>
+      <w:pPr>
+        <w:tabs>
+          <w:tab w:val="left" w:pos="3780"/>
+        </w:tabs>
+      </w:pPr>
+    </w:p>
+    <w:p>
+      <w:pPr>
+        <w:tabs>
+          <w:tab w:val="left" w:pos="3780"/>
+        </w:tabs>
+      </w:pPr>
+    </w:p>
+    <w:p>
+      <w:pPr>
+        <w:tabs>
+          <w:tab w:val="left" w:pos="3780"/>
+        </w:tabs>
+      </w:pPr>
+    </w:p>
+    <w:p>
+      <w:pPr>
+        <w:tabs>
+          <w:tab w:val="left" w:pos="3780"/>
+        </w:tabs>
+      </w:pPr>
+    </w:p>
+    <w:p>
+      <w:pPr>
+        <w:tabs>
+          <w:tab w:val="left" w:pos="3780"/>
+        </w:tabs>
+      </w:pPr>
+    </w:p>
+    <w:p/>
+    <w:p>
+      <w:pPr>
+        <w:rPr>
+          <w:b/>
+          <w:bCs/>
+          <w:sz w:val="28"/>
+          <w:szCs w:val="28"/>
+        </w:rPr>
+      </w:pPr>
+      <w:r>
+        <w:rPr>
+          <w:b/>
+          <w:bCs/>
+          <w:sz w:val="28"/>
+          <w:szCs w:val="28"/>
+        </w:rPr>
+        <w:lastRenderedPageBreak/>
+        <w:t>How to Decide Architecture, Stack, and Backend Language</w:t>
+      </w:r>
+    </w:p>
+    <w:p>
+      <w:pPr>
+        <w:rPr>
+          <w:b/>
+          <w:bCs/>
+        </w:rPr>
+      </w:pPr>
+      <w:r>
+        <w:rPr>
+          <w:b/>
+          <w:bCs/>
+        </w:rPr>
+        <w:t>Step 1: Understand the Project</w:t>
+      </w:r>
+    </w:p>
+    <w:p>
+      <w:r>
+        <w:t>Never choose a language first.</w:t>
+      </w:r>
+    </w:p>
+    <w:p>
+      <w:r>
+        <w:t>Ask questions like:</w:t>
+      </w:r>
+    </w:p>
+    <w:p>
+      <w:pPr>
+        <w:numPr>
+          <w:ilvl w:val="0"/>
+          <w:numId w:val="12"/>
+        </w:numPr>
+      </w:pPr>
+      <w:r>
+        <w:t xml:space="preserve">What problem are we solving? </w:t>
+      </w:r>
+    </w:p>
+    <w:p>
+      <w:pPr>
+        <w:numPr>
+          <w:ilvl w:val="0"/>
+          <w:numId w:val="12"/>
+        </w:numPr>
+      </w:pPr>
+      <w:r>
+        <w:t xml:space="preserve">How many users are expected? </w:t>
+      </w:r>
+    </w:p>
+    <w:p>
+      <w:pPr>
+        <w:numPr>
+          <w:ilvl w:val="0"/>
+          <w:numId w:val="12"/>
+        </w:numPr>
+      </w:pPr>
+      <w:r>
+        <w:t xml:space="preserve">Is it an MVP or a long-term product? </w:t>
+      </w:r>
+    </w:p>
+    <w:p>
+      <w:pPr>
+        <w:numPr>
+          <w:ilvl w:val="0"/>
+          <w:numId w:val="12"/>
+        </w:numPr>
+      </w:pPr>
+      <w:r>
+        <w:t xml:space="preserve">How many developers will work on it? </w:t>
+      </w:r>
+    </w:p>
+    <w:p>
+      <w:pPr>
+        <w:numPr>
+          <w:ilvl w:val="0"/>
+          <w:numId w:val="12"/>
+        </w:numPr>
+      </w:pPr>
+      <w:r>
+        <w:t xml:space="preserve">Will AI be used? </w:t>
+      </w:r>
+    </w:p>
+    <w:p>
+      <w:pPr>
+        <w:numPr>
+          <w:ilvl w:val="0"/>
+          <w:numId w:val="12"/>
+        </w:numPr>
+      </w:pPr>
+      <w:r>
+        <w:t xml:space="preserve">Does it need high performance? </w:t>
+      </w:r>
+    </w:p>
+    <w:p>
+      <w:pPr>
+        <w:numPr>
+          <w:ilvl w:val="0"/>
+          <w:numId w:val="12"/>
+        </w:numPr>
+      </w:pPr>
+      <w:r>
+        <w:t xml:space="preserve">Does it need real-time features? </w:t>
+      </w:r>
+    </w:p>
+    <w:p>
+      <w:r>
+        <w:rPr>
+          <w:b/>
+          <w:bCs/>
+        </w:rPr>
+        <w:t>Reason:</w:t>
+      </w:r>
+      <w:r>
+        <w:t xml:space="preserve"> Good decisions come from requirements, not from favorite technologies.</w:t>
+      </w:r>
+    </w:p>
+    <w:p/>
+    <w:p>
+      <w:pPr>
+        <w:rPr>
+          <w:b/>
+          <w:bCs/>
+        </w:rPr>
+      </w:pPr>
+      <w:r>
+        <w:rPr>
+          <w:b/>
+          <w:bCs/>
+        </w:rPr>
+        <w:t>Step 2: Decide the Architecture</w:t>
+      </w:r>
+    </w:p>
+    <w:p>
+      <w:pPr>
+        <w:rPr>
+          <w:b/>
+          <w:bCs/>
+        </w:rPr>
+      </w:pPr>
+      <w:r>
+        <w:rPr>
+          <w:b/>
+          <w:bCs/>
+        </w:rPr>
+        <w:t>Choose a Monolith if:</w:t>
+      </w:r>
+    </w:p>
+    <w:p>
+      <w:pPr>
+        <w:numPr>
+          <w:ilvl w:val="0"/>
+          <w:numId w:val="13"/>
+        </w:numPr>
+      </w:pPr>
+      <w:r>
+        <w:t xml:space="preserve">Small or medium project </w:t>
+      </w:r>
+    </w:p>
+    <w:p>
+      <w:pPr>
+        <w:numPr>
+          <w:ilvl w:val="0"/>
+          <w:numId w:val="13"/>
+        </w:numPr>
+      </w:pPr>
+      <w:r>
+        <w:t xml:space="preserve">Small team (1-10 developers) </w:t>
+      </w:r>
+    </w:p>
+    <w:p>
+      <w:pPr>
+        <w:numPr>
+          <w:ilvl w:val="0"/>
+          <w:numId w:val="13"/>
+        </w:numPr>
+      </w:pPr>
+      <w:r>
+        <w:t xml:space="preserve">Fast development is important </w:t>
+      </w:r>
+    </w:p>
+    <w:p>
+      <w:pPr>
+        <w:numPr>
+          <w:ilvl w:val="0"/>
+          <w:numId w:val="13"/>
+        </w:numPr>
+      </w:pPr>
+      <w:r>
+        <w:t xml:space="preserve">One deployment is enough </w:t>
+      </w:r>
+    </w:p>
+    <w:p>
+      <w:pPr>
+        <w:numPr>
+          <w:ilvl w:val="0"/>
+          <w:numId w:val="13"/>
+        </w:numPr>
+      </w:pPr>
+      <w:r>
+        <w:t xml:space="preserve">No independent scaling needed </w:t>
+      </w:r>
+    </w:p>
+    <w:p>
+      <w:r>
+        <w:rPr>
+          <w:b/>
+          <w:bCs/>
+        </w:rPr>
+        <w:t>Reason:</w:t>
+      </w:r>
+      <w:r>
+        <w:t xml:space="preserve"> Simpler, faster, and easier to maintain.</w:t>
+      </w:r>
+    </w:p>
+    <w:p/>
+    <w:p/>
+    <w:p/>
+    <w:p/>
+    <w:p/>
+    <w:p>
+      <w:pPr>
+        <w:rPr>
+          <w:b/>
+          <w:bCs/>
+        </w:rPr>
+      </w:pPr>
+      <w:r>
+        <w:rPr>
+          <w:b/>
+          <w:bCs/>
+        </w:rPr>
+        <w:lastRenderedPageBreak/>
+        <w:t>Choose Microservices if:</w:t>
+      </w:r>
+    </w:p>
+    <w:p>
+      <w:pPr>
+        <w:numPr>
+          <w:ilvl w:val="0"/>
+          <w:numId w:val="14"/>
+        </w:numPr>
+      </w:pPr>
+      <w:r>
+        <w:t xml:space="preserve">Large and complex project </w:t>
+      </w:r>
+    </w:p>
+    <w:p>
+      <w:pPr>
+        <w:numPr>
+          <w:ilvl w:val="0"/>
+          <w:numId w:val="14"/>
+        </w:numPr>
+      </w:pPr>
+      <w:r>
+        <w:t xml:space="preserve">Multiple business domains (Users, Orders, Payments, etc.) </w:t>
+      </w:r>
+    </w:p>
+    <w:p>
+      <w:pPr>
+        <w:numPr>
+          <w:ilvl w:val="0"/>
+          <w:numId w:val="14"/>
+        </w:numPr>
+      </w:pPr>
+      <w:r>
+        <w:t xml:space="preserve">Different teams work independently </w:t>
+      </w:r>
+    </w:p>
+    <w:p>
+      <w:pPr>
+        <w:numPr>
+          <w:ilvl w:val="0"/>
+          <w:numId w:val="14"/>
+        </w:numPr>
+      </w:pPr>
+      <w:r>
+        <w:t xml:space="preserve">Independent deployment is required </w:t>
+      </w:r>
+    </w:p>
+    <w:p>
+      <w:pPr>
+        <w:numPr>
+          <w:ilvl w:val="0"/>
+          <w:numId w:val="14"/>
+        </w:numPr>
+      </w:pPr>
+      <w:r>
+        <w:t xml:space="preserve">Some services need more scaling than others </w:t>
+      </w:r>
+    </w:p>
+    <w:p>
+      <w:pPr>
+        <w:numPr>
+          <w:ilvl w:val="0"/>
+          <w:numId w:val="14"/>
+        </w:numPr>
+      </w:pPr>
+      <w:r>
+        <w:t xml:space="preserve">High availability is important </w:t>
+      </w:r>
+    </w:p>
+    <w:p>
+      <w:r>
+        <w:rPr>
+          <w:b/>
+          <w:bCs/>
+        </w:rPr>
+        <w:t>Reason:</w:t>
+      </w:r>
+      <w:r>
+        <w:t xml:space="preserve"> Better scalability, fault isolation, and team independence.</w:t>
+      </w:r>
+    </w:p>
+    <w:p/>
+    <w:p>
+      <w:r>
+        <w:drawing>
+          <wp:inline distT="0" distB="0" distL="0" distR="0" wp14:anchorId="53148F38" wp14:editId="27C130DC">
+            <wp:extent cx="6027420" cy="3261360"/>
+            <wp:effectExtent l="0" t="0" r="0" b="0"/>
+            <wp:docPr id="10760885" name="Picture 1"/>
+            <wp:cNvGraphicFramePr>
+              <a:graphicFrameLocks xmlns:a="http://schemas.openxmlformats.org/drawingml/2006/main" noChangeAspect="1"/>
+            </wp:cNvGraphicFramePr>
+            <a:graphic xmlns:a="http://schemas.openxmlformats.org/drawingml/2006/main">
+              <a:graphicData uri="http://schemas.openxmlformats.org/drawingml/2006/picture">
+                <pic:pic xmlns:pic="http://schemas.openxmlformats.org/drawingml/2006/picture">
+                  <pic:nvPicPr>
+                    <pic:cNvPr id="10760885" name=""/>
+                    <pic:cNvPicPr/>
+                  </pic:nvPicPr>
+                  <pic:blipFill>
+                    <a:blip r:embed="rId5"/>
+                    <a:stretch>
+                      <a:fillRect/>
+                    </a:stretch>
+                  </pic:blipFill>
+                  <pic:spPr>
+                    <a:xfrm>
+                      <a:off x="0" y="0"/>
+                      <a:ext cx="6027420" cy="3261360"/>
+                    </a:xfrm>
+                    <a:prstGeom prst="rect">
+                      <a:avLst/>
+                    </a:prstGeom>
+                  </pic:spPr>
+                </pic:pic>
+              </a:graphicData>
+            </a:graphic>
+          </wp:inline>
+        </w:drawing>
+      </w:r>
+    </w:p>
+    <w:p/>
+    <w:p/>
+    <w:p/>
+    <w:p/>
+    <w:p/>
+    <w:p/>
+    <w:p>
+      <w:pPr>
+        <w:rPr>
+          <w:b/>
+          <w:bCs/>
+          <w:sz w:val="28"/>
+          <w:szCs w:val="28"/>
+        </w:rPr>
+      </w:pPr>
+      <w:r>
+        <w:rPr>
+          <w:b/>
+          <w:bCs/>
+          <w:sz w:val="28"/>
+          <w:szCs w:val="28"/>
+        </w:rPr>
+        <w:lastRenderedPageBreak/>
+        <w:t>Using Multiple Backend Languages in Microservices</w:t>
+      </w:r>
+    </w:p>
+    <w:p>
+      <w:pPr>
+        <w:rPr>
+          <w:b/>
+          <w:bCs/>
+        </w:rPr>
+      </w:pPr>
+      <w:r>
+        <w:rPr>
+          <w:b/>
+          <w:bCs/>
+        </w:rPr>
+        <w:t>Can Different Services Use Different Languages?</w:t>
+      </w:r>
+    </w:p>
+    <w:p>
+      <w:r>
+        <w:rPr>
+          <w:b/>
+          <w:bCs/>
+        </w:rPr>
+        <w:t>Yes.</w:t>
+      </w:r>
+      <w:r>
+        <w:t xml:space="preserve"> In a microservices architecture, each service is an independent application. This means every service can use the language that best fits its responsibility.</w:t>
+      </w:r>
+    </w:p>
+    <w:p>
+      <w:pPr>
+        <w:rPr>
+          <w:b/>
+          <w:bCs/>
+        </w:rPr>
+      </w:pPr>
+      <w:r>
+        <w:rPr>
+          <w:b/>
+          <w:bCs/>
+        </w:rPr>
+        <w:t>Example</w:t>
+      </w:r>
+    </w:p>
+    <w:p>
+      <w:r>
+        <w:t xml:space="preserve">Auth Service      → </w:t>
+      </w:r>
+      <w:proofErr w:type="spellStart"/>
+      <w:r>
+        <w:t>NestJS</w:t>
+      </w:r>
+      <w:proofErr w:type="spellEnd"/>
+      <w:r>
+        <w:t xml:space="preserve"> (Node.js)</w:t>
+      </w:r>
+    </w:p>
+    <w:p>
+      <w:r>
+        <w:t xml:space="preserve">Product Service   → </w:t>
+      </w:r>
+      <w:proofErr w:type="spellStart"/>
+      <w:r>
+        <w:t>NestJS</w:t>
+      </w:r>
+      <w:proofErr w:type="spellEnd"/>
+      <w:r>
+        <w:t xml:space="preserve"> (Node.js)</w:t>
+      </w:r>
+    </w:p>
+    <w:p>
+      <w:r>
+        <w:t>AI Service        → Python (</w:t>
+      </w:r>
+      <w:proofErr w:type="spellStart"/>
+      <w:r>
+        <w:t>FastAPI</w:t>
+      </w:r>
+      <w:proofErr w:type="spellEnd"/>
+      <w:r>
+        <w:t>)</w:t>
+      </w:r>
+    </w:p>
+    <w:p>
+      <w:r>
+        <w:t>Notification      → Go</w:t>
+      </w:r>
+    </w:p>
+    <w:p>
+      <w:r>
+        <w:t xml:space="preserve">This approach is called </w:t>
+      </w:r>
+      <w:r>
+        <w:rPr>
+          <w:b/>
+          <w:bCs/>
+        </w:rPr>
+        <w:t>Polyglot Architecture</w:t>
+      </w:r>
+      <w:r>
+        <w:t>.</w:t>
+      </w:r>
+    </w:p>
+    <w:p>
+      <w:r>
+        <w:pict w14:anchorId="6D817C6C">
+          <v:rect id="_x0000_i1067" style="width:0;height:1.5pt" o:hralign="center" o:hrstd="t" o:hr="t" fillcolor="#a0a0a0" stroked="f"/>
+        </w:pict>
+      </w:r>
+    </w:p>
+    <w:p>
+      <w:pPr>
+        <w:rPr>
+          <w:b/>
+          <w:bCs/>
+        </w:rPr>
+      </w:pPr>
+      <w:r>
+        <w:rPr>
+          <w:b/>
+          <w:bCs/>
+        </w:rPr>
+        <w:t>Does It Affect Development?</w:t>
+      </w:r>
+    </w:p>
+    <w:p>
+      <w:r>
+        <w:rPr>
+          <w:b/>
+          <w:bCs/>
+        </w:rPr>
+        <w:t>No.</w:t>
+      </w:r>
+    </w:p>
+    <w:p>
+      <w:r>
+        <w:t>Each developer works only on their own service.</w:t>
+      </w:r>
+    </w:p>
+    <w:p>
+      <w:pPr>
+        <w:rPr>
+          <w:b/>
+          <w:bCs/>
+        </w:rPr>
+      </w:pPr>
+      <w:r>
+        <w:rPr>
+          <w:b/>
+          <w:bCs/>
+        </w:rPr>
+        <w:t>Example</w:t>
+      </w:r>
+    </w:p>
+    <w:p>
+      <w:r>
+        <w:t>Developer A</w:t>
+      </w:r>
+    </w:p>
+    <w:p>
+      <w:r>
+        <w:t>└── Auth Service (</w:t>
+      </w:r>
+      <w:proofErr w:type="spellStart"/>
+      <w:r>
+        <w:t>NestJS</w:t>
+      </w:r>
+      <w:proofErr w:type="spellEnd"/>
+      <w:r>
+        <w:t>)</w:t>
+      </w:r>
+    </w:p>
+    <w:p>
+      <w:r>
+        <w:t>Developer B</w:t>
+      </w:r>
+    </w:p>
+    <w:p>
+      <w:r>
+        <w:t>└── AI Service (Python)</w:t>
+      </w:r>
+    </w:p>
+    <w:p>
+      <w:r>
+        <w:t>There are no code conflicts because both services are separate projects.</w:t>
+      </w:r>
+    </w:p>
+    <w:p>
+      <w:r>
+        <w:pict w14:anchorId="1B8F342C">
+          <v:rect id="_x0000_i1068" style="width:0;height:1.5pt" o:hralign="center" o:hrstd="t" o:hr="t" fillcolor="#a0a0a0" stroked="f"/>
+        </w:pict>
+      </w:r>
+    </w:p>
+    <w:p>
+      <w:pPr>
+        <w:rPr>
+          <w:b/>
+          <w:bCs/>
+        </w:rPr>
+      </w:pPr>
+      <w:r>
+        <w:rPr>
+          <w:b/>
+          <w:bCs/>
+        </w:rPr>
+        <w:t>Does It Affect Deployment?</w:t>
+      </w:r>
+    </w:p>
+    <w:p>
+      <w:r>
+        <w:rPr>
+          <w:b/>
+          <w:bCs/>
+        </w:rPr>
+        <w:t>No.</w:t>
+      </w:r>
+    </w:p>
+    <w:p>
+      <w:r>
+        <w:t>Each service is deployed independently.</w:t>
+      </w:r>
+    </w:p>
+    <w:p>
+      <w:r>
+        <w:t>Auth Service</w:t>
+      </w:r>
+    </w:p>
+    <w:p>
+      <w:r>
+        <w:t>└── Deploy</w:t>
+      </w:r>
+    </w:p>
+    <w:p/>
+    <w:p>
+      <w:r>
+        <w:t>AI Service</w:t>
+      </w:r>
+    </w:p>
+    <w:p>
+      <w:r>
+        <w:t>└── Deploy</w:t>
+      </w:r>
+    </w:p>
+    <w:p>
+      <w:r>
+        <w:t>If the AI Service is updated, only the AI Service is redeployed. The Auth Service continues running without interruption.</w:t>
+      </w:r>
+    </w:p>
+    <w:p>
+      <w:r>
+        <w:pict w14:anchorId="5FD1360D">
+          <v:rect id="_x0000_i1069" style="width:0;height:1.5pt" o:hralign="center" o:hrstd="t" o:hr="t" fillcolor="#a0a0a0" stroked="f"/>
+        </w:pict>
+      </w:r>
+    </w:p>
+    <w:p>
+      <w:pPr>
+        <w:rPr>
+          <w:b/>
+          <w:bCs/>
+        </w:rPr>
+      </w:pPr>
+      <w:r>
+        <w:rPr>
+          <w:b/>
+          <w:bCs/>
+        </w:rPr>
+        <w:t>How Do Services Communicate?</w:t>
+      </w:r>
+    </w:p>
+    <w:p>
+      <w:r>
+        <w:t>The programming language does not matter.</w:t>
+      </w:r>
+    </w:p>
+    <w:p>
+      <w:r>
+        <w:t>Services communicate through standard protocols such as:</w:t>
+      </w:r>
+    </w:p>
+    <w:p>
+      <w:pPr>
+        <w:numPr>
+          <w:ilvl w:val="0"/>
+          <w:numId w:val="15"/>
+        </w:numPr>
+      </w:pPr>
+      <w:r>
+        <w:t>HTTP / REST API</w:t>
+      </w:r>
+    </w:p>
+    <w:p>
+      <w:pPr>
+        <w:numPr>
+          <w:ilvl w:val="0"/>
+          <w:numId w:val="15"/>
+        </w:numPr>
+      </w:pPr>
+      <w:proofErr w:type="spellStart"/>
+      <w:r>
+        <w:t>gRPC</w:t>
+      </w:r>
+      <w:proofErr w:type="spellEnd"/>
+    </w:p>
+    <w:p>
+      <w:pPr>
+        <w:numPr>
+          <w:ilvl w:val="0"/>
+          <w:numId w:val="15"/>
+        </w:numPr>
+      </w:pPr>
+      <w:r>
+        <w:t>Message Brokers (RabbitMQ, Kafka, NATS)</w:t>
+      </w:r>
+    </w:p>
+    <w:p>
+      <w:r>
+        <w:t>As long as the API contract is the same, services written in different languages can communicate without any issues.</w:t>
+      </w:r>
+    </w:p>
+    <w:p>
+      <w:r>
+        <w:pict w14:anchorId="78138828">
+          <v:rect id="_x0000_i1070" style="width:0;height:1.5pt" o:hralign="center" o:hrstd="t" o:hr="t" fillcolor="#a0a0a0" stroked="f"/>
+        </w:pict>
+      </w:r>
+    </w:p>
+    <w:p>
+      <w:pPr>
+        <w:rPr>
+          <w:b/>
+          <w:bCs/>
+        </w:rPr>
+      </w:pPr>
+      <w:r>
+        <w:rPr>
+          <w:b/>
+          <w:bCs/>
+        </w:rPr>
+        <w:t>Things to Consider</w:t>
+      </w:r>
+    </w:p>
+    <w:p>
+      <w:r>
+        <w:t>Using multiple languages also means:</w:t>
+      </w:r>
+    </w:p>
+    <w:p>
+      <w:pPr>
+        <w:numPr>
+          <w:ilvl w:val="0"/>
+          <w:numId w:val="16"/>
+        </w:numPr>
+      </w:pPr>
+      <w:r>
+        <w:t>Different runtimes (Node.js, Python, Go)</w:t>
+      </w:r>
+    </w:p>
+    <w:p>
+      <w:pPr>
+        <w:numPr>
+          <w:ilvl w:val="0"/>
+          <w:numId w:val="16"/>
+        </w:numPr>
+      </w:pPr>
+      <w:r>
+        <w:t>Different package managers (</w:t>
+      </w:r>
+      <w:proofErr w:type="spellStart"/>
+      <w:r>
+        <w:t>npm</w:t>
+      </w:r>
+      <w:proofErr w:type="spellEnd"/>
+      <w:r>
+        <w:t>, pip)</w:t>
+      </w:r>
+    </w:p>
+    <w:p>
+      <w:pPr>
+        <w:numPr>
+          <w:ilvl w:val="0"/>
+          <w:numId w:val="16"/>
+        </w:numPr>
+      </w:pPr>
+      <w:r>
+        <w:t>Different build and deployment pipelines</w:t>
+      </w:r>
+    </w:p>
+    <w:p>
+      <w:pPr>
+        <w:numPr>
+          <w:ilvl w:val="0"/>
+          <w:numId w:val="16"/>
+        </w:numPr>
+      </w:pPr>
+      <w:r>
+        <w:t>Team members may need knowledge of multiple languages</w:t>
+      </w:r>
+    </w:p>
+    <w:p>
+      <w:r>
+        <w:pict w14:anchorId="205B54E7">
+          <v:rect id="_x0000_i1071" style="width:0;height:1.5pt" o:hralign="center" o:hrstd="t" o:hr="t" fillcolor="#a0a0a0" stroked="f"/>
+        </w:pict>
+      </w:r>
+    </w:p>
+    <w:p>
+      <w:pPr>
+        <w:rPr>
+          <w:b/>
+          <w:bCs/>
+        </w:rPr>
+      </w:pPr>
+    </w:p>
+    <w:p>
+      <w:pPr>
+        <w:rPr>
+          <w:b/>
+          <w:bCs/>
+        </w:rPr>
+      </w:pPr>
+    </w:p>
+    <w:p>
+      <w:pPr>
+        <w:rPr>
+          <w:b/>
+          <w:bCs/>
+        </w:rPr>
+      </w:pPr>
+    </w:p>
+    <w:p>
+      <w:pPr>
+        <w:rPr>
+          <w:b/>
+          <w:bCs/>
+        </w:rPr>
+      </w:pPr>
+    </w:p>
+    <w:p>
+      <w:pPr>
+        <w:rPr>
+          <w:b/>
+          <w:bCs/>
+        </w:rPr>
+      </w:pPr>
+    </w:p>
+    <w:p>
+      <w:pPr>
+        <w:rPr>
+          <w:b/>
+          <w:bCs/>
+          <w:sz w:val="28"/>
+          <w:szCs w:val="28"/>
+        </w:rPr>
+      </w:pPr>
+      <w:r>
+        <w:rPr>
+          <w:b/>
+          <w:bCs/>
+          <w:sz w:val="28"/>
+          <w:szCs w:val="28"/>
+        </w:rPr>
+        <w:lastRenderedPageBreak/>
+        <w:t>Why Use Polyglot Architecture in Microservices?</w:t>
+      </w:r>
+    </w:p>
+    <w:p>
+      <w:r>
+        <w:t>In microservices, each service has a different responsibility. One language may not be the best choice for every service.</w:t>
+      </w:r>
+    </w:p>
+    <w:p>
+      <w:r>
+        <w:t>Using different languages allows each service to use the technology that best fits its job.</w:t>
+      </w:r>
+    </w:p>
+    <w:p>
+      <w:pPr>
+        <w:rPr>
+          <w:b/>
+          <w:bCs/>
+        </w:rPr>
+      </w:pPr>
+      <w:r>
+        <w:rPr>
+          <w:b/>
+          <w:bCs/>
+        </w:rPr>
+        <w:t>Example</w:t>
+      </w:r>
+    </w:p>
+    <w:p>
+      <w:r>
+        <w:t xml:space="preserve">Auth Service      → </w:t>
+      </w:r>
+      <w:proofErr w:type="spellStart"/>
+      <w:r>
+        <w:t>NestJS</w:t>
+      </w:r>
+      <w:proofErr w:type="spellEnd"/>
+      <w:r>
+        <w:t xml:space="preserve"> (Fast API development)</w:t>
+      </w:r>
+    </w:p>
+    <w:p>
+      <w:r>
+        <w:t>AI Service        → Python (Best AI &amp; ML ecosystem)</w:t>
+      </w:r>
+    </w:p>
+    <w:p>
+      <w:r>
+        <w:t>Search Service    → Go (High performance)</w:t>
+      </w:r>
+    </w:p>
+    <w:p>
+      <w:pPr>
+        <w:rPr>
+          <w:b/>
+          <w:bCs/>
+        </w:rPr>
+      </w:pPr>
+      <w:r>
+        <w:rPr>
+          <w:b/>
+          <w:bCs/>
+        </w:rPr>
+        <w:t>Why?</w:t>
+      </w:r>
+    </w:p>
+    <w:p>
+      <w:pPr>
+        <w:numPr>
+          <w:ilvl w:val="0"/>
+          <w:numId w:val="17"/>
+        </w:numPr>
+      </w:pPr>
+      <w:r>
+        <w:t>Choose the best tool for each service.</w:t>
+      </w:r>
+    </w:p>
+    <w:p>
+      <w:pPr>
+        <w:numPr>
+          <w:ilvl w:val="0"/>
+          <w:numId w:val="17"/>
+        </w:numPr>
+      </w:pPr>
+      <w:r>
+        <w:t>Improve performance where needed.</w:t>
+      </w:r>
+    </w:p>
+    <w:p>
+      <w:pPr>
+        <w:numPr>
+          <w:ilvl w:val="0"/>
+          <w:numId w:val="17"/>
+        </w:numPr>
+      </w:pPr>
+      <w:r>
+        <w:t>Use the strongest ecosystem for a specific task (e.g., Python for AI).</w:t>
+      </w:r>
+    </w:p>
+    <w:p>
+      <w:pPr>
+        <w:numPr>
+          <w:ilvl w:val="0"/>
+          <w:numId w:val="17"/>
+        </w:numPr>
+      </w:pPr>
+      <w:r>
+        <w:t>Each service remains independent, so changing one language does not affect the others.</w:t>
       </w:r>
     </w:p>
     <w:p/>
@@ -1648,6 +3459,751 @@
     </w:lvl>
   </w:abstractNum>
   <w:abstractNum w:abstractNumId="3" w15:restartNumberingAfterBreak="0">
+    <w:nsid w:val="233865C9"/>
+    <w:multiLevelType w:val="multilevel"/>
+    <w:tmpl w:val="2160AAB4"/>
+    <w:lvl w:ilvl="0">
+      <w:start w:val="1"/>
+      <w:numFmt w:val="bullet"/>
+      <w:lvlText w:val=""/>
+      <w:lvlJc w:val="left"/>
+      <w:pPr>
+        <w:tabs>
+          <w:tab w:val="num" w:pos="720"/>
+        </w:tabs>
+        <w:ind w:left="720" w:hanging="360"/>
+      </w:pPr>
+      <w:rPr>
+        <w:rFonts w:ascii="Symbol" w:hAnsi="Symbol" w:hint="default"/>
+        <w:sz w:val="20"/>
+      </w:rPr>
+    </w:lvl>
+    <w:lvl w:ilvl="1" w:tentative="1">
+      <w:start w:val="1"/>
+      <w:numFmt w:val="bullet"/>
+      <w:lvlText w:val="o"/>
+      <w:lvlJc w:val="left"/>
+      <w:pPr>
+        <w:tabs>
+          <w:tab w:val="num" w:pos="1440"/>
+        </w:tabs>
+        <w:ind w:left="1440" w:hanging="360"/>
+      </w:pPr>
+      <w:rPr>
+        <w:rFonts w:ascii="Courier New" w:hAnsi="Courier New" w:hint="default"/>
+        <w:sz w:val="20"/>
+      </w:rPr>
+    </w:lvl>
+    <w:lvl w:ilvl="2" w:tentative="1">
+      <w:start w:val="1"/>
+      <w:numFmt w:val="bullet"/>
+      <w:lvlText w:val=""/>
+      <w:lvlJc w:val="left"/>
+      <w:pPr>
+        <w:tabs>
+          <w:tab w:val="num" w:pos="2160"/>
+        </w:tabs>
+        <w:ind w:left="2160" w:hanging="360"/>
+      </w:pPr>
+      <w:rPr>
+        <w:rFonts w:ascii="Wingdings" w:hAnsi="Wingdings" w:hint="default"/>
+        <w:sz w:val="20"/>
+      </w:rPr>
+    </w:lvl>
+    <w:lvl w:ilvl="3" w:tentative="1">
+      <w:start w:val="1"/>
+      <w:numFmt w:val="bullet"/>
+      <w:lvlText w:val=""/>
+      <w:lvlJc w:val="left"/>
+      <w:pPr>
+        <w:tabs>
+          <w:tab w:val="num" w:pos="2880"/>
+        </w:tabs>
+        <w:ind w:left="2880" w:hanging="360"/>
+      </w:pPr>
+      <w:rPr>
+        <w:rFonts w:ascii="Wingdings" w:hAnsi="Wingdings" w:hint="default"/>
+        <w:sz w:val="20"/>
+      </w:rPr>
+    </w:lvl>
+    <w:lvl w:ilvl="4" w:tentative="1">
+      <w:start w:val="1"/>
+      <w:numFmt w:val="bullet"/>
+      <w:lvlText w:val=""/>
+      <w:lvlJc w:val="left"/>
+      <w:pPr>
+        <w:tabs>
+          <w:tab w:val="num" w:pos="3600"/>
+        </w:tabs>
+        <w:ind w:left="3600" w:hanging="360"/>
+      </w:pPr>
+      <w:rPr>
+        <w:rFonts w:ascii="Wingdings" w:hAnsi="Wingdings" w:hint="default"/>
+        <w:sz w:val="20"/>
+      </w:rPr>
+    </w:lvl>
+    <w:lvl w:ilvl="5" w:tentative="1">
+      <w:start w:val="1"/>
+      <w:numFmt w:val="bullet"/>
+      <w:lvlText w:val=""/>
+      <w:lvlJc w:val="left"/>
+      <w:pPr>
+        <w:tabs>
+          <w:tab w:val="num" w:pos="4320"/>
+        </w:tabs>
+        <w:ind w:left="4320" w:hanging="360"/>
+      </w:pPr>
+      <w:rPr>
+        <w:rFonts w:ascii="Wingdings" w:hAnsi="Wingdings" w:hint="default"/>
+        <w:sz w:val="20"/>
+      </w:rPr>
+    </w:lvl>
+    <w:lvl w:ilvl="6" w:tentative="1">
+      <w:start w:val="1"/>
+      <w:numFmt w:val="bullet"/>
+      <w:lvlText w:val=""/>
+      <w:lvlJc w:val="left"/>
+      <w:pPr>
+        <w:tabs>
+          <w:tab w:val="num" w:pos="5040"/>
+        </w:tabs>
+        <w:ind w:left="5040" w:hanging="360"/>
+      </w:pPr>
+      <w:rPr>
+        <w:rFonts w:ascii="Wingdings" w:hAnsi="Wingdings" w:hint="default"/>
+        <w:sz w:val="20"/>
+      </w:rPr>
+    </w:lvl>
+    <w:lvl w:ilvl="7" w:tentative="1">
+      <w:start w:val="1"/>
+      <w:numFmt w:val="bullet"/>
+      <w:lvlText w:val=""/>
+      <w:lvlJc w:val="left"/>
+      <w:pPr>
+        <w:tabs>
+          <w:tab w:val="num" w:pos="5760"/>
+        </w:tabs>
+        <w:ind w:left="5760" w:hanging="360"/>
+      </w:pPr>
+      <w:rPr>
+        <w:rFonts w:ascii="Wingdings" w:hAnsi="Wingdings" w:hint="default"/>
+        <w:sz w:val="20"/>
+      </w:rPr>
+    </w:lvl>
+    <w:lvl w:ilvl="8" w:tentative="1">
+      <w:start w:val="1"/>
+      <w:numFmt w:val="bullet"/>
+      <w:lvlText w:val=""/>
+      <w:lvlJc w:val="left"/>
+      <w:pPr>
+        <w:tabs>
+          <w:tab w:val="num" w:pos="6480"/>
+        </w:tabs>
+        <w:ind w:left="6480" w:hanging="360"/>
+      </w:pPr>
+      <w:rPr>
+        <w:rFonts w:ascii="Wingdings" w:hAnsi="Wingdings" w:hint="default"/>
+        <w:sz w:val="20"/>
+      </w:rPr>
+    </w:lvl>
+  </w:abstractNum>
+  <w:abstractNum w:abstractNumId="4" w15:restartNumberingAfterBreak="0">
+    <w:nsid w:val="252E12FC"/>
+    <w:multiLevelType w:val="multilevel"/>
+    <w:tmpl w:val="2384FD3C"/>
+    <w:lvl w:ilvl="0">
+      <w:start w:val="1"/>
+      <w:numFmt w:val="bullet"/>
+      <w:lvlText w:val=""/>
+      <w:lvlJc w:val="left"/>
+      <w:pPr>
+        <w:tabs>
+          <w:tab w:val="num" w:pos="720"/>
+        </w:tabs>
+        <w:ind w:left="720" w:hanging="360"/>
+      </w:pPr>
+      <w:rPr>
+        <w:rFonts w:ascii="Symbol" w:hAnsi="Symbol" w:hint="default"/>
+        <w:sz w:val="20"/>
+      </w:rPr>
+    </w:lvl>
+    <w:lvl w:ilvl="1" w:tentative="1">
+      <w:start w:val="1"/>
+      <w:numFmt w:val="bullet"/>
+      <w:lvlText w:val="o"/>
+      <w:lvlJc w:val="left"/>
+      <w:pPr>
+        <w:tabs>
+          <w:tab w:val="num" w:pos="1440"/>
+        </w:tabs>
+        <w:ind w:left="1440" w:hanging="360"/>
+      </w:pPr>
+      <w:rPr>
+        <w:rFonts w:ascii="Courier New" w:hAnsi="Courier New" w:hint="default"/>
+        <w:sz w:val="20"/>
+      </w:rPr>
+    </w:lvl>
+    <w:lvl w:ilvl="2" w:tentative="1">
+      <w:start w:val="1"/>
+      <w:numFmt w:val="bullet"/>
+      <w:lvlText w:val=""/>
+      <w:lvlJc w:val="left"/>
+      <w:pPr>
+        <w:tabs>
+          <w:tab w:val="num" w:pos="2160"/>
+        </w:tabs>
+        <w:ind w:left="2160" w:hanging="360"/>
+      </w:pPr>
+      <w:rPr>
+        <w:rFonts w:ascii="Wingdings" w:hAnsi="Wingdings" w:hint="default"/>
+        <w:sz w:val="20"/>
+      </w:rPr>
+    </w:lvl>
+    <w:lvl w:ilvl="3" w:tentative="1">
+      <w:start w:val="1"/>
+      <w:numFmt w:val="bullet"/>
+      <w:lvlText w:val=""/>
+      <w:lvlJc w:val="left"/>
+      <w:pPr>
+        <w:tabs>
+          <w:tab w:val="num" w:pos="2880"/>
+        </w:tabs>
+        <w:ind w:left="2880" w:hanging="360"/>
+      </w:pPr>
+      <w:rPr>
+        <w:rFonts w:ascii="Wingdings" w:hAnsi="Wingdings" w:hint="default"/>
+        <w:sz w:val="20"/>
+      </w:rPr>
+    </w:lvl>
+    <w:lvl w:ilvl="4" w:tentative="1">
+      <w:start w:val="1"/>
+      <w:numFmt w:val="bullet"/>
+      <w:lvlText w:val=""/>
+      <w:lvlJc w:val="left"/>
+      <w:pPr>
+        <w:tabs>
+          <w:tab w:val="num" w:pos="3600"/>
+        </w:tabs>
+        <w:ind w:left="3600" w:hanging="360"/>
+      </w:pPr>
+      <w:rPr>
+        <w:rFonts w:ascii="Wingdings" w:hAnsi="Wingdings" w:hint="default"/>
+        <w:sz w:val="20"/>
+      </w:rPr>
+    </w:lvl>
+    <w:lvl w:ilvl="5" w:tentative="1">
+      <w:start w:val="1"/>
+      <w:numFmt w:val="bullet"/>
+      <w:lvlText w:val=""/>
+      <w:lvlJc w:val="left"/>
+      <w:pPr>
+        <w:tabs>
+          <w:tab w:val="num" w:pos="4320"/>
+        </w:tabs>
+        <w:ind w:left="4320" w:hanging="360"/>
+      </w:pPr>
+      <w:rPr>
+        <w:rFonts w:ascii="Wingdings" w:hAnsi="Wingdings" w:hint="default"/>
+        <w:sz w:val="20"/>
+      </w:rPr>
+    </w:lvl>
+    <w:lvl w:ilvl="6" w:tentative="1">
+      <w:start w:val="1"/>
+      <w:numFmt w:val="bullet"/>
+      <w:lvlText w:val=""/>
+      <w:lvlJc w:val="left"/>
+      <w:pPr>
+        <w:tabs>
+          <w:tab w:val="num" w:pos="5040"/>
+        </w:tabs>
+        <w:ind w:left="5040" w:hanging="360"/>
+      </w:pPr>
+      <w:rPr>
+        <w:rFonts w:ascii="Wingdings" w:hAnsi="Wingdings" w:hint="default"/>
+        <w:sz w:val="20"/>
+      </w:rPr>
+    </w:lvl>
+    <w:lvl w:ilvl="7" w:tentative="1">
+      <w:start w:val="1"/>
+      <w:numFmt w:val="bullet"/>
+      <w:lvlText w:val=""/>
+      <w:lvlJc w:val="left"/>
+      <w:pPr>
+        <w:tabs>
+          <w:tab w:val="num" w:pos="5760"/>
+        </w:tabs>
+        <w:ind w:left="5760" w:hanging="360"/>
+      </w:pPr>
+      <w:rPr>
+        <w:rFonts w:ascii="Wingdings" w:hAnsi="Wingdings" w:hint="default"/>
+        <w:sz w:val="20"/>
+      </w:rPr>
+    </w:lvl>
+    <w:lvl w:ilvl="8" w:tentative="1">
+      <w:start w:val="1"/>
+      <w:numFmt w:val="bullet"/>
+      <w:lvlText w:val=""/>
+      <w:lvlJc w:val="left"/>
+      <w:pPr>
+        <w:tabs>
+          <w:tab w:val="num" w:pos="6480"/>
+        </w:tabs>
+        <w:ind w:left="6480" w:hanging="360"/>
+      </w:pPr>
+      <w:rPr>
+        <w:rFonts w:ascii="Wingdings" w:hAnsi="Wingdings" w:hint="default"/>
+        <w:sz w:val="20"/>
+      </w:rPr>
+    </w:lvl>
+  </w:abstractNum>
+  <w:abstractNum w:abstractNumId="5" w15:restartNumberingAfterBreak="0">
+    <w:nsid w:val="2AC87989"/>
+    <w:multiLevelType w:val="multilevel"/>
+    <w:tmpl w:val="A00A0618"/>
+    <w:lvl w:ilvl="0">
+      <w:start w:val="1"/>
+      <w:numFmt w:val="bullet"/>
+      <w:lvlText w:val=""/>
+      <w:lvlJc w:val="left"/>
+      <w:pPr>
+        <w:tabs>
+          <w:tab w:val="num" w:pos="720"/>
+        </w:tabs>
+        <w:ind w:left="720" w:hanging="360"/>
+      </w:pPr>
+      <w:rPr>
+        <w:rFonts w:ascii="Symbol" w:hAnsi="Symbol" w:hint="default"/>
+        <w:sz w:val="20"/>
+      </w:rPr>
+    </w:lvl>
+    <w:lvl w:ilvl="1" w:tentative="1">
+      <w:start w:val="1"/>
+      <w:numFmt w:val="bullet"/>
+      <w:lvlText w:val="o"/>
+      <w:lvlJc w:val="left"/>
+      <w:pPr>
+        <w:tabs>
+          <w:tab w:val="num" w:pos="1440"/>
+        </w:tabs>
+        <w:ind w:left="1440" w:hanging="360"/>
+      </w:pPr>
+      <w:rPr>
+        <w:rFonts w:ascii="Courier New" w:hAnsi="Courier New" w:hint="default"/>
+        <w:sz w:val="20"/>
+      </w:rPr>
+    </w:lvl>
+    <w:lvl w:ilvl="2" w:tentative="1">
+      <w:start w:val="1"/>
+      <w:numFmt w:val="bullet"/>
+      <w:lvlText w:val=""/>
+      <w:lvlJc w:val="left"/>
+      <w:pPr>
+        <w:tabs>
+          <w:tab w:val="num" w:pos="2160"/>
+        </w:tabs>
+        <w:ind w:left="2160" w:hanging="360"/>
+      </w:pPr>
+      <w:rPr>
+        <w:rFonts w:ascii="Wingdings" w:hAnsi="Wingdings" w:hint="default"/>
+        <w:sz w:val="20"/>
+      </w:rPr>
+    </w:lvl>
+    <w:lvl w:ilvl="3" w:tentative="1">
+      <w:start w:val="1"/>
+      <w:numFmt w:val="bullet"/>
+      <w:lvlText w:val=""/>
+      <w:lvlJc w:val="left"/>
+      <w:pPr>
+        <w:tabs>
+          <w:tab w:val="num" w:pos="2880"/>
+        </w:tabs>
+        <w:ind w:left="2880" w:hanging="360"/>
+      </w:pPr>
+      <w:rPr>
+        <w:rFonts w:ascii="Wingdings" w:hAnsi="Wingdings" w:hint="default"/>
+        <w:sz w:val="20"/>
+      </w:rPr>
+    </w:lvl>
+    <w:lvl w:ilvl="4" w:tentative="1">
+      <w:start w:val="1"/>
+      <w:numFmt w:val="bullet"/>
+      <w:lvlText w:val=""/>
+      <w:lvlJc w:val="left"/>
+      <w:pPr>
+        <w:tabs>
+          <w:tab w:val="num" w:pos="3600"/>
+        </w:tabs>
+        <w:ind w:left="3600" w:hanging="360"/>
+      </w:pPr>
+      <w:rPr>
+        <w:rFonts w:ascii="Wingdings" w:hAnsi="Wingdings" w:hint="default"/>
+        <w:sz w:val="20"/>
+      </w:rPr>
+    </w:lvl>
+    <w:lvl w:ilvl="5" w:tentative="1">
+      <w:start w:val="1"/>
+      <w:numFmt w:val="bullet"/>
+      <w:lvlText w:val=""/>
+      <w:lvlJc w:val="left"/>
+      <w:pPr>
+        <w:tabs>
+          <w:tab w:val="num" w:pos="4320"/>
+        </w:tabs>
+        <w:ind w:left="4320" w:hanging="360"/>
+      </w:pPr>
+      <w:rPr>
+        <w:rFonts w:ascii="Wingdings" w:hAnsi="Wingdings" w:hint="default"/>
+        <w:sz w:val="20"/>
+      </w:rPr>
+    </w:lvl>
+    <w:lvl w:ilvl="6" w:tentative="1">
+      <w:start w:val="1"/>
+      <w:numFmt w:val="bullet"/>
+      <w:lvlText w:val=""/>
+      <w:lvlJc w:val="left"/>
+      <w:pPr>
+        <w:tabs>
+          <w:tab w:val="num" w:pos="5040"/>
+        </w:tabs>
+        <w:ind w:left="5040" w:hanging="360"/>
+      </w:pPr>
+      <w:rPr>
+        <w:rFonts w:ascii="Wingdings" w:hAnsi="Wingdings" w:hint="default"/>
+        <w:sz w:val="20"/>
+      </w:rPr>
+    </w:lvl>
+    <w:lvl w:ilvl="7" w:tentative="1">
+      <w:start w:val="1"/>
+      <w:numFmt w:val="bullet"/>
+      <w:lvlText w:val=""/>
+      <w:lvlJc w:val="left"/>
+      <w:pPr>
+        <w:tabs>
+          <w:tab w:val="num" w:pos="5760"/>
+        </w:tabs>
+        <w:ind w:left="5760" w:hanging="360"/>
+      </w:pPr>
+      <w:rPr>
+        <w:rFonts w:ascii="Wingdings" w:hAnsi="Wingdings" w:hint="default"/>
+        <w:sz w:val="20"/>
+      </w:rPr>
+    </w:lvl>
+    <w:lvl w:ilvl="8" w:tentative="1">
+      <w:start w:val="1"/>
+      <w:numFmt w:val="bullet"/>
+      <w:lvlText w:val=""/>
+      <w:lvlJc w:val="left"/>
+      <w:pPr>
+        <w:tabs>
+          <w:tab w:val="num" w:pos="6480"/>
+        </w:tabs>
+        <w:ind w:left="6480" w:hanging="360"/>
+      </w:pPr>
+      <w:rPr>
+        <w:rFonts w:ascii="Wingdings" w:hAnsi="Wingdings" w:hint="default"/>
+        <w:sz w:val="20"/>
+      </w:rPr>
+    </w:lvl>
+  </w:abstractNum>
+  <w:abstractNum w:abstractNumId="6" w15:restartNumberingAfterBreak="0">
+    <w:nsid w:val="3282683B"/>
+    <w:multiLevelType w:val="multilevel"/>
+    <w:tmpl w:val="D764D706"/>
+    <w:lvl w:ilvl="0">
+      <w:start w:val="1"/>
+      <w:numFmt w:val="bullet"/>
+      <w:lvlText w:val=""/>
+      <w:lvlJc w:val="left"/>
+      <w:pPr>
+        <w:tabs>
+          <w:tab w:val="num" w:pos="720"/>
+        </w:tabs>
+        <w:ind w:left="720" w:hanging="360"/>
+      </w:pPr>
+      <w:rPr>
+        <w:rFonts w:ascii="Symbol" w:hAnsi="Symbol" w:hint="default"/>
+        <w:sz w:val="20"/>
+      </w:rPr>
+    </w:lvl>
+    <w:lvl w:ilvl="1" w:tentative="1">
+      <w:start w:val="1"/>
+      <w:numFmt w:val="bullet"/>
+      <w:lvlText w:val="o"/>
+      <w:lvlJc w:val="left"/>
+      <w:pPr>
+        <w:tabs>
+          <w:tab w:val="num" w:pos="1440"/>
+        </w:tabs>
+        <w:ind w:left="1440" w:hanging="360"/>
+      </w:pPr>
+      <w:rPr>
+        <w:rFonts w:ascii="Courier New" w:hAnsi="Courier New" w:hint="default"/>
+        <w:sz w:val="20"/>
+      </w:rPr>
+    </w:lvl>
+    <w:lvl w:ilvl="2" w:tentative="1">
+      <w:start w:val="1"/>
+      <w:numFmt w:val="bullet"/>
+      <w:lvlText w:val=""/>
+      <w:lvlJc w:val="left"/>
+      <w:pPr>
+        <w:tabs>
+          <w:tab w:val="num" w:pos="2160"/>
+        </w:tabs>
+        <w:ind w:left="2160" w:hanging="360"/>
+      </w:pPr>
+      <w:rPr>
+        <w:rFonts w:ascii="Wingdings" w:hAnsi="Wingdings" w:hint="default"/>
+        <w:sz w:val="20"/>
+      </w:rPr>
+    </w:lvl>
+    <w:lvl w:ilvl="3" w:tentative="1">
+      <w:start w:val="1"/>
+      <w:numFmt w:val="bullet"/>
+      <w:lvlText w:val=""/>
+      <w:lvlJc w:val="left"/>
+      <w:pPr>
+        <w:tabs>
+          <w:tab w:val="num" w:pos="2880"/>
+        </w:tabs>
+        <w:ind w:left="2880" w:hanging="360"/>
+      </w:pPr>
+      <w:rPr>
+        <w:rFonts w:ascii="Wingdings" w:hAnsi="Wingdings" w:hint="default"/>
+        <w:sz w:val="20"/>
+      </w:rPr>
+    </w:lvl>
+    <w:lvl w:ilvl="4" w:tentative="1">
+      <w:start w:val="1"/>
+      <w:numFmt w:val="bullet"/>
+      <w:lvlText w:val=""/>
+      <w:lvlJc w:val="left"/>
+      <w:pPr>
+        <w:tabs>
+          <w:tab w:val="num" w:pos="3600"/>
+        </w:tabs>
+        <w:ind w:left="3600" w:hanging="360"/>
+      </w:pPr>
+      <w:rPr>
+        <w:rFonts w:ascii="Wingdings" w:hAnsi="Wingdings" w:hint="default"/>
+        <w:sz w:val="20"/>
+      </w:rPr>
+    </w:lvl>
+    <w:lvl w:ilvl="5" w:tentative="1">
+      <w:start w:val="1"/>
+      <w:numFmt w:val="bullet"/>
+      <w:lvlText w:val=""/>
+      <w:lvlJc w:val="left"/>
+      <w:pPr>
+        <w:tabs>
+          <w:tab w:val="num" w:pos="4320"/>
+        </w:tabs>
+        <w:ind w:left="4320" w:hanging="360"/>
+      </w:pPr>
+      <w:rPr>
+        <w:rFonts w:ascii="Wingdings" w:hAnsi="Wingdings" w:hint="default"/>
+        <w:sz w:val="20"/>
+      </w:rPr>
+    </w:lvl>
+    <w:lvl w:ilvl="6" w:tentative="1">
+      <w:start w:val="1"/>
+      <w:numFmt w:val="bullet"/>
+      <w:lvlText w:val=""/>
+      <w:lvlJc w:val="left"/>
+      <w:pPr>
+        <w:tabs>
+          <w:tab w:val="num" w:pos="5040"/>
+        </w:tabs>
+        <w:ind w:left="5040" w:hanging="360"/>
+      </w:pPr>
+      <w:rPr>
+        <w:rFonts w:ascii="Wingdings" w:hAnsi="Wingdings" w:hint="default"/>
+        <w:sz w:val="20"/>
+      </w:rPr>
+    </w:lvl>
+    <w:lvl w:ilvl="7" w:tentative="1">
+      <w:start w:val="1"/>
+      <w:numFmt w:val="bullet"/>
+      <w:lvlText w:val=""/>
+      <w:lvlJc w:val="left"/>
+      <w:pPr>
+        <w:tabs>
+          <w:tab w:val="num" w:pos="5760"/>
+        </w:tabs>
+        <w:ind w:left="5760" w:hanging="360"/>
+      </w:pPr>
+      <w:rPr>
+        <w:rFonts w:ascii="Wingdings" w:hAnsi="Wingdings" w:hint="default"/>
+        <w:sz w:val="20"/>
+      </w:rPr>
+    </w:lvl>
+    <w:lvl w:ilvl="8" w:tentative="1">
+      <w:start w:val="1"/>
+      <w:numFmt w:val="bullet"/>
+      <w:lvlText w:val=""/>
+      <w:lvlJc w:val="left"/>
+      <w:pPr>
+        <w:tabs>
+          <w:tab w:val="num" w:pos="6480"/>
+        </w:tabs>
+        <w:ind w:left="6480" w:hanging="360"/>
+      </w:pPr>
+      <w:rPr>
+        <w:rFonts w:ascii="Wingdings" w:hAnsi="Wingdings" w:hint="default"/>
+        <w:sz w:val="20"/>
+      </w:rPr>
+    </w:lvl>
+  </w:abstractNum>
+  <w:abstractNum w:abstractNumId="7" w15:restartNumberingAfterBreak="0">
+    <w:nsid w:val="39B334E7"/>
+    <w:multiLevelType w:val="multilevel"/>
+    <w:tmpl w:val="93C435E0"/>
+    <w:lvl w:ilvl="0">
+      <w:start w:val="1"/>
+      <w:numFmt w:val="bullet"/>
+      <w:lvlText w:val=""/>
+      <w:lvlJc w:val="left"/>
+      <w:pPr>
+        <w:tabs>
+          <w:tab w:val="num" w:pos="720"/>
+        </w:tabs>
+        <w:ind w:left="720" w:hanging="360"/>
+      </w:pPr>
+      <w:rPr>
+        <w:rFonts w:ascii="Symbol" w:hAnsi="Symbol" w:hint="default"/>
+        <w:sz w:val="20"/>
+      </w:rPr>
+    </w:lvl>
+    <w:lvl w:ilvl="1" w:tentative="1">
+      <w:start w:val="1"/>
+      <w:numFmt w:val="bullet"/>
+      <w:lvlText w:val="o"/>
+      <w:lvlJc w:val="left"/>
+      <w:pPr>
+        <w:tabs>
+          <w:tab w:val="num" w:pos="1440"/>
+        </w:tabs>
+        <w:ind w:left="1440" w:hanging="360"/>
+      </w:pPr>
+      <w:rPr>
+        <w:rFonts w:ascii="Courier New" w:hAnsi="Courier New" w:hint="default"/>
+        <w:sz w:val="20"/>
+      </w:rPr>
+    </w:lvl>
+    <w:lvl w:ilvl="2" w:tentative="1">
+      <w:start w:val="1"/>
+      <w:numFmt w:val="bullet"/>
+      <w:lvlText w:val=""/>
+      <w:lvlJc w:val="left"/>
+      <w:pPr>
+        <w:tabs>
+          <w:tab w:val="num" w:pos="2160"/>
+        </w:tabs>
+        <w:ind w:left="2160" w:hanging="360"/>
+      </w:pPr>
+      <w:rPr>
+        <w:rFonts w:ascii="Wingdings" w:hAnsi="Wingdings" w:hint="default"/>
+        <w:sz w:val="20"/>
+      </w:rPr>
+    </w:lvl>
+    <w:lvl w:ilvl="3" w:tentative="1">
+      <w:start w:val="1"/>
+      <w:numFmt w:val="bullet"/>
+      <w:lvlText w:val=""/>
+      <w:lvlJc w:val="left"/>
+      <w:pPr>
+        <w:tabs>
+          <w:tab w:val="num" w:pos="2880"/>
+        </w:tabs>
+        <w:ind w:left="2880" w:hanging="360"/>
+      </w:pPr>
+      <w:rPr>
+        <w:rFonts w:ascii="Wingdings" w:hAnsi="Wingdings" w:hint="default"/>
+        <w:sz w:val="20"/>
+      </w:rPr>
+    </w:lvl>
+    <w:lvl w:ilvl="4" w:tentative="1">
+      <w:start w:val="1"/>
+      <w:numFmt w:val="bullet"/>
+      <w:lvlText w:val=""/>
+      <w:lvlJc w:val="left"/>
+      <w:pPr>
+        <w:tabs>
+          <w:tab w:val="num" w:pos="3600"/>
+        </w:tabs>
+        <w:ind w:left="3600" w:hanging="360"/>
+      </w:pPr>
+      <w:rPr>
+        <w:rFonts w:ascii="Wingdings" w:hAnsi="Wingdings" w:hint="default"/>
+        <w:sz w:val="20"/>
+      </w:rPr>
+    </w:lvl>
+    <w:lvl w:ilvl="5" w:tentative="1">
+      <w:start w:val="1"/>
+      <w:numFmt w:val="bullet"/>
+      <w:lvlText w:val=""/>
+      <w:lvlJc w:val="left"/>
+      <w:pPr>
+        <w:tabs>
+          <w:tab w:val="num" w:pos="4320"/>
+        </w:tabs>
+        <w:ind w:left="4320" w:hanging="360"/>
+      </w:pPr>
+      <w:rPr>
+        <w:rFonts w:ascii="Wingdings" w:hAnsi="Wingdings" w:hint="default"/>
+        <w:sz w:val="20"/>
+      </w:rPr>
+    </w:lvl>
+    <w:lvl w:ilvl="6" w:tentative="1">
+      <w:start w:val="1"/>
+      <w:numFmt w:val="bullet"/>
+      <w:lvlText w:val=""/>
+      <w:lvlJc w:val="left"/>
+      <w:pPr>
+        <w:tabs>
+          <w:tab w:val="num" w:pos="5040"/>
+        </w:tabs>
+        <w:ind w:left="5040" w:hanging="360"/>
+      </w:pPr>
+      <w:rPr>
+        <w:rFonts w:ascii="Wingdings" w:hAnsi="Wingdings" w:hint="default"/>
+        <w:sz w:val="20"/>
+      </w:rPr>
+    </w:lvl>
+    <w:lvl w:ilvl="7" w:tentative="1">
+      <w:start w:val="1"/>
+      <w:numFmt w:val="bullet"/>
+      <w:lvlText w:val=""/>
+      <w:lvlJc w:val="left"/>
+      <w:pPr>
+        <w:tabs>
+          <w:tab w:val="num" w:pos="5760"/>
+        </w:tabs>
+        <w:ind w:left="5760" w:hanging="360"/>
+      </w:pPr>
+      <w:rPr>
+        <w:rFonts w:ascii="Wingdings" w:hAnsi="Wingdings" w:hint="default"/>
+        <w:sz w:val="20"/>
+      </w:rPr>
+    </w:lvl>
+    <w:lvl w:ilvl="8" w:tentative="1">
+      <w:start w:val="1"/>
+      <w:numFmt w:val="bullet"/>
+      <w:lvlText w:val=""/>
+      <w:lvlJc w:val="left"/>
+      <w:pPr>
+        <w:tabs>
+          <w:tab w:val="num" w:pos="6480"/>
+        </w:tabs>
+        <w:ind w:left="6480" w:hanging="360"/>
+      </w:pPr>
+      <w:rPr>
+        <w:rFonts w:ascii="Wingdings" w:hAnsi="Wingdings" w:hint="default"/>
+        <w:sz w:val="20"/>
+      </w:rPr>
+    </w:lvl>
+  </w:abstractNum>
+  <w:abstractNum w:abstractNumId="8" w15:restartNumberingAfterBreak="0">
     <w:nsid w:val="4D2C58CC"/>
     <w:multiLevelType w:val="multilevel"/>
     <w:tmpl w:val="B9E88950"/>
@@ -1796,7 +4352,7 @@
       </w:rPr>
     </w:lvl>
   </w:abstractNum>
-  <w:abstractNum w:abstractNumId="4" w15:restartNumberingAfterBreak="0">
+  <w:abstractNum w:abstractNumId="9" w15:restartNumberingAfterBreak="0">
     <w:nsid w:val="4E0604EE"/>
     <w:multiLevelType w:val="multilevel"/>
     <w:tmpl w:val="9286C6B2"/>
@@ -1945,7 +4501,7 @@
       </w:rPr>
     </w:lvl>
   </w:abstractNum>
-  <w:abstractNum w:abstractNumId="5" w15:restartNumberingAfterBreak="0">
+  <w:abstractNum w:abstractNumId="10" w15:restartNumberingAfterBreak="0">
     <w:nsid w:val="50C14F9D"/>
     <w:multiLevelType w:val="multilevel"/>
     <w:tmpl w:val="242E42C0"/>
@@ -2094,7 +4650,7 @@
       </w:rPr>
     </w:lvl>
   </w:abstractNum>
-  <w:abstractNum w:abstractNumId="6" w15:restartNumberingAfterBreak="0">
+  <w:abstractNum w:abstractNumId="11" w15:restartNumberingAfterBreak="0">
     <w:nsid w:val="51A01E9A"/>
     <w:multiLevelType w:val="multilevel"/>
     <w:tmpl w:val="4004434C"/>
@@ -2243,7 +4799,7 @@
       </w:rPr>
     </w:lvl>
   </w:abstractNum>
-  <w:abstractNum w:abstractNumId="7" w15:restartNumberingAfterBreak="0">
+  <w:abstractNum w:abstractNumId="12" w15:restartNumberingAfterBreak="0">
     <w:nsid w:val="58922D5D"/>
     <w:multiLevelType w:val="multilevel"/>
     <w:tmpl w:val="E2FA3690"/>
@@ -2392,7 +4948,156 @@
       </w:rPr>
     </w:lvl>
   </w:abstractNum>
-  <w:abstractNum w:abstractNumId="8" w15:restartNumberingAfterBreak="0">
+  <w:abstractNum w:abstractNumId="13" w15:restartNumberingAfterBreak="0">
+    <w:nsid w:val="5E5945D8"/>
+    <w:multiLevelType w:val="multilevel"/>
+    <w:tmpl w:val="75F6C9B8"/>
+    <w:lvl w:ilvl="0">
+      <w:start w:val="1"/>
+      <w:numFmt w:val="bullet"/>
+      <w:lvlText w:val=""/>
+      <w:lvlJc w:val="left"/>
+      <w:pPr>
+        <w:tabs>
+          <w:tab w:val="num" w:pos="720"/>
+        </w:tabs>
+        <w:ind w:left="720" w:hanging="360"/>
+      </w:pPr>
+      <w:rPr>
+        <w:rFonts w:ascii="Symbol" w:hAnsi="Symbol" w:hint="default"/>
+        <w:sz w:val="20"/>
+      </w:rPr>
+    </w:lvl>
+    <w:lvl w:ilvl="1" w:tentative="1">
+      <w:start w:val="1"/>
+      <w:numFmt w:val="bullet"/>
+      <w:lvlText w:val="o"/>
+      <w:lvlJc w:val="left"/>
+      <w:pPr>
+        <w:tabs>
+          <w:tab w:val="num" w:pos="1440"/>
+        </w:tabs>
+        <w:ind w:left="1440" w:hanging="360"/>
+      </w:pPr>
+      <w:rPr>
+        <w:rFonts w:ascii="Courier New" w:hAnsi="Courier New" w:hint="default"/>
+        <w:sz w:val="20"/>
+      </w:rPr>
+    </w:lvl>
+    <w:lvl w:ilvl="2" w:tentative="1">
+      <w:start w:val="1"/>
+      <w:numFmt w:val="bullet"/>
+      <w:lvlText w:val=""/>
+      <w:lvlJc w:val="left"/>
+      <w:pPr>
+        <w:tabs>
+          <w:tab w:val="num" w:pos="2160"/>
+        </w:tabs>
+        <w:ind w:left="2160" w:hanging="360"/>
+      </w:pPr>
+      <w:rPr>
+        <w:rFonts w:ascii="Wingdings" w:hAnsi="Wingdings" w:hint="default"/>
+        <w:sz w:val="20"/>
+      </w:rPr>
+    </w:lvl>
+    <w:lvl w:ilvl="3" w:tentative="1">
+      <w:start w:val="1"/>
+      <w:numFmt w:val="bullet"/>
+      <w:lvlText w:val=""/>
+      <w:lvlJc w:val="left"/>
+      <w:pPr>
+        <w:tabs>
+          <w:tab w:val="num" w:pos="2880"/>
+        </w:tabs>
+        <w:ind w:left="2880" w:hanging="360"/>
+      </w:pPr>
+      <w:rPr>
+        <w:rFonts w:ascii="Wingdings" w:hAnsi="Wingdings" w:hint="default"/>
+        <w:sz w:val="20"/>
+      </w:rPr>
+    </w:lvl>
+    <w:lvl w:ilvl="4" w:tentative="1">
+      <w:start w:val="1"/>
+      <w:numFmt w:val="bullet"/>
+      <w:lvlText w:val=""/>
+      <w:lvlJc w:val="left"/>
+      <w:pPr>
+        <w:tabs>
+          <w:tab w:val="num" w:pos="3600"/>
+        </w:tabs>
+        <w:ind w:left="3600" w:hanging="360"/>
+      </w:pPr>
+      <w:rPr>
+        <w:rFonts w:ascii="Wingdings" w:hAnsi="Wingdings" w:hint="default"/>
+        <w:sz w:val="20"/>
+      </w:rPr>
+    </w:lvl>
+    <w:lvl w:ilvl="5" w:tentative="1">
+      <w:start w:val="1"/>
+      <w:numFmt w:val="bullet"/>
+      <w:lvlText w:val=""/>
+      <w:lvlJc w:val="left"/>
+      <w:pPr>
+        <w:tabs>
+          <w:tab w:val="num" w:pos="4320"/>
+        </w:tabs>
+        <w:ind w:left="4320" w:hanging="360"/>
+      </w:pPr>
+      <w:rPr>
+        <w:rFonts w:ascii="Wingdings" w:hAnsi="Wingdings" w:hint="default"/>
+        <w:sz w:val="20"/>
+      </w:rPr>
+    </w:lvl>
+    <w:lvl w:ilvl="6" w:tentative="1">
+      <w:start w:val="1"/>
+      <w:numFmt w:val="bullet"/>
+      <w:lvlText w:val=""/>
+      <w:lvlJc w:val="left"/>
+      <w:pPr>
+        <w:tabs>
+          <w:tab w:val="num" w:pos="5040"/>
+        </w:tabs>
+        <w:ind w:left="5040" w:hanging="360"/>
+      </w:pPr>
+      <w:rPr>
+        <w:rFonts w:ascii="Wingdings" w:hAnsi="Wingdings" w:hint="default"/>
+        <w:sz w:val="20"/>
+      </w:rPr>
+    </w:lvl>
+    <w:lvl w:ilvl="7" w:tentative="1">
+      <w:start w:val="1"/>
+      <w:numFmt w:val="bullet"/>
+      <w:lvlText w:val=""/>
+      <w:lvlJc w:val="left"/>
+      <w:pPr>
+        <w:tabs>
+          <w:tab w:val="num" w:pos="5760"/>
+        </w:tabs>
+        <w:ind w:left="5760" w:hanging="360"/>
+      </w:pPr>
+      <w:rPr>
+        <w:rFonts w:ascii="Wingdings" w:hAnsi="Wingdings" w:hint="default"/>
+        <w:sz w:val="20"/>
+      </w:rPr>
+    </w:lvl>
+    <w:lvl w:ilvl="8" w:tentative="1">
+      <w:start w:val="1"/>
+      <w:numFmt w:val="bullet"/>
+      <w:lvlText w:val=""/>
+      <w:lvlJc w:val="left"/>
+      <w:pPr>
+        <w:tabs>
+          <w:tab w:val="num" w:pos="6480"/>
+        </w:tabs>
+        <w:ind w:left="6480" w:hanging="360"/>
+      </w:pPr>
+      <w:rPr>
+        <w:rFonts w:ascii="Wingdings" w:hAnsi="Wingdings" w:hint="default"/>
+        <w:sz w:val="20"/>
+      </w:rPr>
+    </w:lvl>
+  </w:abstractNum>
+  <w:abstractNum w:abstractNumId="14" w15:restartNumberingAfterBreak="0">
     <w:nsid w:val="647938D8"/>
     <w:multiLevelType w:val="multilevel"/>
     <w:tmpl w:val="CB923FB0"/>
@@ -2541,11 +5246,309 @@
       </w:rPr>
     </w:lvl>
   </w:abstractNum>
+  <w:abstractNum w:abstractNumId="15" w15:restartNumberingAfterBreak="0">
+    <w:nsid w:val="67A03567"/>
+    <w:multiLevelType w:val="multilevel"/>
+    <w:tmpl w:val="E6C0CF4A"/>
+    <w:lvl w:ilvl="0">
+      <w:start w:val="1"/>
+      <w:numFmt w:val="bullet"/>
+      <w:lvlText w:val=""/>
+      <w:lvlJc w:val="left"/>
+      <w:pPr>
+        <w:tabs>
+          <w:tab w:val="num" w:pos="720"/>
+        </w:tabs>
+        <w:ind w:left="720" w:hanging="360"/>
+      </w:pPr>
+      <w:rPr>
+        <w:rFonts w:ascii="Symbol" w:hAnsi="Symbol" w:hint="default"/>
+        <w:sz w:val="20"/>
+      </w:rPr>
+    </w:lvl>
+    <w:lvl w:ilvl="1" w:tentative="1">
+      <w:start w:val="1"/>
+      <w:numFmt w:val="bullet"/>
+      <w:lvlText w:val="o"/>
+      <w:lvlJc w:val="left"/>
+      <w:pPr>
+        <w:tabs>
+          <w:tab w:val="num" w:pos="1440"/>
+        </w:tabs>
+        <w:ind w:left="1440" w:hanging="360"/>
+      </w:pPr>
+      <w:rPr>
+        <w:rFonts w:ascii="Courier New" w:hAnsi="Courier New" w:hint="default"/>
+        <w:sz w:val="20"/>
+      </w:rPr>
+    </w:lvl>
+    <w:lvl w:ilvl="2" w:tentative="1">
+      <w:start w:val="1"/>
+      <w:numFmt w:val="bullet"/>
+      <w:lvlText w:val=""/>
+      <w:lvlJc w:val="left"/>
+      <w:pPr>
+        <w:tabs>
+          <w:tab w:val="num" w:pos="2160"/>
+        </w:tabs>
+        <w:ind w:left="2160" w:hanging="360"/>
+      </w:pPr>
+      <w:rPr>
+        <w:rFonts w:ascii="Wingdings" w:hAnsi="Wingdings" w:hint="default"/>
+        <w:sz w:val="20"/>
+      </w:rPr>
+    </w:lvl>
+    <w:lvl w:ilvl="3" w:tentative="1">
+      <w:start w:val="1"/>
+      <w:numFmt w:val="bullet"/>
+      <w:lvlText w:val=""/>
+      <w:lvlJc w:val="left"/>
+      <w:pPr>
+        <w:tabs>
+          <w:tab w:val="num" w:pos="2880"/>
+        </w:tabs>
+        <w:ind w:left="2880" w:hanging="360"/>
+      </w:pPr>
+      <w:rPr>
+        <w:rFonts w:ascii="Wingdings" w:hAnsi="Wingdings" w:hint="default"/>
+        <w:sz w:val="20"/>
+      </w:rPr>
+    </w:lvl>
+    <w:lvl w:ilvl="4" w:tentative="1">
+      <w:start w:val="1"/>
+      <w:numFmt w:val="bullet"/>
+      <w:lvlText w:val=""/>
+      <w:lvlJc w:val="left"/>
+      <w:pPr>
+        <w:tabs>
+          <w:tab w:val="num" w:pos="3600"/>
+        </w:tabs>
+        <w:ind w:left="3600" w:hanging="360"/>
+      </w:pPr>
+      <w:rPr>
+        <w:rFonts w:ascii="Wingdings" w:hAnsi="Wingdings" w:hint="default"/>
+        <w:sz w:val="20"/>
+      </w:rPr>
+    </w:lvl>
+    <w:lvl w:ilvl="5" w:tentative="1">
+      <w:start w:val="1"/>
+      <w:numFmt w:val="bullet"/>
+      <w:lvlText w:val=""/>
+      <w:lvlJc w:val="left"/>
+      <w:pPr>
+        <w:tabs>
+          <w:tab w:val="num" w:pos="4320"/>
+        </w:tabs>
+        <w:ind w:left="4320" w:hanging="360"/>
+      </w:pPr>
+      <w:rPr>
+        <w:rFonts w:ascii="Wingdings" w:hAnsi="Wingdings" w:hint="default"/>
+        <w:sz w:val="20"/>
+      </w:rPr>
+    </w:lvl>
+    <w:lvl w:ilvl="6" w:tentative="1">
+      <w:start w:val="1"/>
+      <w:numFmt w:val="bullet"/>
+      <w:lvlText w:val=""/>
+      <w:lvlJc w:val="left"/>
+      <w:pPr>
+        <w:tabs>
+          <w:tab w:val="num" w:pos="5040"/>
+        </w:tabs>
+        <w:ind w:left="5040" w:hanging="360"/>
+      </w:pPr>
+      <w:rPr>
+        <w:rFonts w:ascii="Wingdings" w:hAnsi="Wingdings" w:hint="default"/>
+        <w:sz w:val="20"/>
+      </w:rPr>
+    </w:lvl>
+    <w:lvl w:ilvl="7" w:tentative="1">
+      <w:start w:val="1"/>
+      <w:numFmt w:val="bullet"/>
+      <w:lvlText w:val=""/>
+      <w:lvlJc w:val="left"/>
+      <w:pPr>
+        <w:tabs>
+          <w:tab w:val="num" w:pos="5760"/>
+        </w:tabs>
+        <w:ind w:left="5760" w:hanging="360"/>
+      </w:pPr>
+      <w:rPr>
+        <w:rFonts w:ascii="Wingdings" w:hAnsi="Wingdings" w:hint="default"/>
+        <w:sz w:val="20"/>
+      </w:rPr>
+    </w:lvl>
+    <w:lvl w:ilvl="8" w:tentative="1">
+      <w:start w:val="1"/>
+      <w:numFmt w:val="bullet"/>
+      <w:lvlText w:val=""/>
+      <w:lvlJc w:val="left"/>
+      <w:pPr>
+        <w:tabs>
+          <w:tab w:val="num" w:pos="6480"/>
+        </w:tabs>
+        <w:ind w:left="6480" w:hanging="360"/>
+      </w:pPr>
+      <w:rPr>
+        <w:rFonts w:ascii="Wingdings" w:hAnsi="Wingdings" w:hint="default"/>
+        <w:sz w:val="20"/>
+      </w:rPr>
+    </w:lvl>
+  </w:abstractNum>
+  <w:abstractNum w:abstractNumId="16" w15:restartNumberingAfterBreak="0">
+    <w:nsid w:val="77D567A1"/>
+    <w:multiLevelType w:val="multilevel"/>
+    <w:tmpl w:val="B50031F4"/>
+    <w:lvl w:ilvl="0">
+      <w:start w:val="1"/>
+      <w:numFmt w:val="bullet"/>
+      <w:lvlText w:val=""/>
+      <w:lvlJc w:val="left"/>
+      <w:pPr>
+        <w:tabs>
+          <w:tab w:val="num" w:pos="720"/>
+        </w:tabs>
+        <w:ind w:left="720" w:hanging="360"/>
+      </w:pPr>
+      <w:rPr>
+        <w:rFonts w:ascii="Symbol" w:hAnsi="Symbol" w:hint="default"/>
+        <w:sz w:val="20"/>
+      </w:rPr>
+    </w:lvl>
+    <w:lvl w:ilvl="1" w:tentative="1">
+      <w:start w:val="1"/>
+      <w:numFmt w:val="bullet"/>
+      <w:lvlText w:val="o"/>
+      <w:lvlJc w:val="left"/>
+      <w:pPr>
+        <w:tabs>
+          <w:tab w:val="num" w:pos="1440"/>
+        </w:tabs>
+        <w:ind w:left="1440" w:hanging="360"/>
+      </w:pPr>
+      <w:rPr>
+        <w:rFonts w:ascii="Courier New" w:hAnsi="Courier New" w:hint="default"/>
+        <w:sz w:val="20"/>
+      </w:rPr>
+    </w:lvl>
+    <w:lvl w:ilvl="2" w:tentative="1">
+      <w:start w:val="1"/>
+      <w:numFmt w:val="bullet"/>
+      <w:lvlText w:val=""/>
+      <w:lvlJc w:val="left"/>
+      <w:pPr>
+        <w:tabs>
+          <w:tab w:val="num" w:pos="2160"/>
+        </w:tabs>
+        <w:ind w:left="2160" w:hanging="360"/>
+      </w:pPr>
+      <w:rPr>
+        <w:rFonts w:ascii="Wingdings" w:hAnsi="Wingdings" w:hint="default"/>
+        <w:sz w:val="20"/>
+      </w:rPr>
+    </w:lvl>
+    <w:lvl w:ilvl="3" w:tentative="1">
+      <w:start w:val="1"/>
+      <w:numFmt w:val="bullet"/>
+      <w:lvlText w:val=""/>
+      <w:lvlJc w:val="left"/>
+      <w:pPr>
+        <w:tabs>
+          <w:tab w:val="num" w:pos="2880"/>
+        </w:tabs>
+        <w:ind w:left="2880" w:hanging="360"/>
+      </w:pPr>
+      <w:rPr>
+        <w:rFonts w:ascii="Wingdings" w:hAnsi="Wingdings" w:hint="default"/>
+        <w:sz w:val="20"/>
+      </w:rPr>
+    </w:lvl>
+    <w:lvl w:ilvl="4" w:tentative="1">
+      <w:start w:val="1"/>
+      <w:numFmt w:val="bullet"/>
+      <w:lvlText w:val=""/>
+      <w:lvlJc w:val="left"/>
+      <w:pPr>
+        <w:tabs>
+          <w:tab w:val="num" w:pos="3600"/>
+        </w:tabs>
+        <w:ind w:left="3600" w:hanging="360"/>
+      </w:pPr>
+      <w:rPr>
+        <w:rFonts w:ascii="Wingdings" w:hAnsi="Wingdings" w:hint="default"/>
+        <w:sz w:val="20"/>
+      </w:rPr>
+    </w:lvl>
+    <w:lvl w:ilvl="5" w:tentative="1">
+      <w:start w:val="1"/>
+      <w:numFmt w:val="bullet"/>
+      <w:lvlText w:val=""/>
+      <w:lvlJc w:val="left"/>
+      <w:pPr>
+        <w:tabs>
+          <w:tab w:val="num" w:pos="4320"/>
+        </w:tabs>
+        <w:ind w:left="4320" w:hanging="360"/>
+      </w:pPr>
+      <w:rPr>
+        <w:rFonts w:ascii="Wingdings" w:hAnsi="Wingdings" w:hint="default"/>
+        <w:sz w:val="20"/>
+      </w:rPr>
+    </w:lvl>
+    <w:lvl w:ilvl="6" w:tentative="1">
+      <w:start w:val="1"/>
+      <w:numFmt w:val="bullet"/>
+      <w:lvlText w:val=""/>
+      <w:lvlJc w:val="left"/>
+      <w:pPr>
+        <w:tabs>
+          <w:tab w:val="num" w:pos="5040"/>
+        </w:tabs>
+        <w:ind w:left="5040" w:hanging="360"/>
+      </w:pPr>
+      <w:rPr>
+        <w:rFonts w:ascii="Wingdings" w:hAnsi="Wingdings" w:hint="default"/>
+        <w:sz w:val="20"/>
+      </w:rPr>
+    </w:lvl>
+    <w:lvl w:ilvl="7" w:tentative="1">
+      <w:start w:val="1"/>
+      <w:numFmt w:val="bullet"/>
+      <w:lvlText w:val=""/>
+      <w:lvlJc w:val="left"/>
+      <w:pPr>
+        <w:tabs>
+          <w:tab w:val="num" w:pos="5760"/>
+        </w:tabs>
+        <w:ind w:left="5760" w:hanging="360"/>
+      </w:pPr>
+      <w:rPr>
+        <w:rFonts w:ascii="Wingdings" w:hAnsi="Wingdings" w:hint="default"/>
+        <w:sz w:val="20"/>
+      </w:rPr>
+    </w:lvl>
+    <w:lvl w:ilvl="8" w:tentative="1">
+      <w:start w:val="1"/>
+      <w:numFmt w:val="bullet"/>
+      <w:lvlText w:val=""/>
+      <w:lvlJc w:val="left"/>
+      <w:pPr>
+        <w:tabs>
+          <w:tab w:val="num" w:pos="6480"/>
+        </w:tabs>
+        <w:ind w:left="6480" w:hanging="360"/>
+      </w:pPr>
+      <w:rPr>
+        <w:rFonts w:ascii="Wingdings" w:hAnsi="Wingdings" w:hint="default"/>
+        <w:sz w:val="20"/>
+      </w:rPr>
+    </w:lvl>
+  </w:abstractNum>
   <w:num w:numId="1" w16cid:durableId="544684684">
-    <w:abstractNumId w:val="4"/>
+    <w:abstractNumId w:val="9"/>
   </w:num>
   <w:num w:numId="2" w16cid:durableId="625237121">
-    <w:abstractNumId w:val="3"/>
+    <w:abstractNumId w:val="8"/>
   </w:num>
   <w:num w:numId="3" w16cid:durableId="276911725">
     <w:abstractNumId w:val="2"/>
@@ -2554,19 +5557,43 @@
     <w:abstractNumId w:val="0"/>
   </w:num>
   <w:num w:numId="5" w16cid:durableId="346366276">
-    <w:abstractNumId w:val="5"/>
+    <w:abstractNumId w:val="10"/>
   </w:num>
   <w:num w:numId="6" w16cid:durableId="1115756989">
-    <w:abstractNumId w:val="7"/>
+    <w:abstractNumId w:val="12"/>
   </w:num>
   <w:num w:numId="7" w16cid:durableId="1192185452">
-    <w:abstractNumId w:val="8"/>
+    <w:abstractNumId w:val="14"/>
   </w:num>
   <w:num w:numId="8" w16cid:durableId="269511157">
-    <w:abstractNumId w:val="6"/>
+    <w:abstractNumId w:val="11"/>
   </w:num>
   <w:num w:numId="9" w16cid:durableId="718557993">
     <w:abstractNumId w:val="1"/>
+  </w:num>
+  <w:num w:numId="10" w16cid:durableId="1482115687">
+    <w:abstractNumId w:val="4"/>
+  </w:num>
+  <w:num w:numId="11" w16cid:durableId="604651813">
+    <w:abstractNumId w:val="13"/>
+  </w:num>
+  <w:num w:numId="12" w16cid:durableId="1383023254">
+    <w:abstractNumId w:val="6"/>
+  </w:num>
+  <w:num w:numId="13" w16cid:durableId="1624992400">
+    <w:abstractNumId w:val="16"/>
+  </w:num>
+  <w:num w:numId="14" w16cid:durableId="1979416014">
+    <w:abstractNumId w:val="15"/>
+  </w:num>
+  <w:num w:numId="15" w16cid:durableId="561523271">
+    <w:abstractNumId w:val="3"/>
+  </w:num>
+  <w:num w:numId="16" w16cid:durableId="57439118">
+    <w:abstractNumId w:val="5"/>
+  </w:num>
+  <w:num w:numId="17" w16cid:durableId="601111495">
+    <w:abstractNumId w:val="7"/>
   </w:num>
 </w:numbering>
 </file>
@@ -2971,6 +5998,7 @@
   <w:style w:type="paragraph" w:default="1" w:styleId="Normal">
     <w:name w:val="Normal"/>
     <w:qFormat/>
+    <w:rsid w:val="00E24B2E"/>
   </w:style>
   <w:style w:type="paragraph" w:styleId="Heading1">
     <w:name w:val="heading 1"/>

</xml_diff>